<commit_message>
docs: diagnostic design — section 8 « Priorité 3 réalisée », feuille de route mise à jour
Pagination côté base, mode sombre, résumé hebdomadaire des alertes par
e-mail (et variables à renseigner pour l'activer), tests de bout en bout ;
captures en clair et en sombre, bilan des suites de tests.

Co-Authored-By: Claude Opus 5.5 <noreply@anthropic.com>
Claude-Session: https://claude.ai/code/session_01Li2W9WshQNGLFvtEf7D8Zo
</commit_message>
<xml_diff>
--- a/docs/Diagnostic_Design_Fonctionnalites.docx
+++ b/docs/Diagnostic_Design_Fonctionnalites.docx
@@ -82,7 +82,7 @@
           <w:sz w:val="20"/>
           <w:szCs w:val="20"/>
         </w:rPr>
-        <w:t xml:space="preserve">4 octobre 2026 — mis à jour avec la réalisation des priorités 1 et 2</w:t>
+        <w:t xml:space="preserve">5 octobre 2026 — mis à jour avec la réalisation des priorités 1, 2 et 3</w:t>
       </w:r>
     </w:p>
     <w:p>
@@ -140,7 +140,7 @@
           <w:sz w:val="21"/>
           <w:szCs w:val="21"/>
         </w:rPr>
-        <w:t xml:space="preserve">L'application a été lancée en local avec les données de démonstration (12 projets) et parcourue écran par écran, sur grand écran (1 440 px) et sur téléphone (390 px). Ce parcours, complété par une revue du code de l'interface, fait ressortir 14 constats. Les 10 plus utiles ont été corrigés, puis les priorités 1 et 2 de la feuille de route ont été réalisées (sections 6 et 7) ; la priorité 3 reste à faire (section 5).</w:t>
+        <w:t xml:space="preserve">L'application a été lancée en local avec les données de démonstration (12 projets) et parcourue écran par écran, sur grand écran (1 440 px) et sur téléphone (390 px). Ce parcours, complété par une revue du code de l'interface, fait ressortir 14 constats. Les 10 plus utiles ont été corrigés, puis les trois priorités de la feuille de route ont été réalisées (sections 6, 7 et 8).</w:t>
       </w:r>
     </w:p>
     <w:tbl>
@@ -1880,11 +1880,11 @@
                 <w:rFonts w:ascii="Calibri" w:cs="Calibri" w:eastAsia="Calibri" w:hAnsi="Calibri"/>
                 <w:b w:val="false"/>
                 <w:bCs w:val="false"/>
-                <w:color w:val="B45F06"/>
-                <w:sz w:val="18"/>
-                <w:szCs w:val="18"/>
-              </w:rPr>
-              <w:t xml:space="preserve">Export et notifications : corrigé ; pagination : priorité 3</w:t>
+                <w:color w:val="2E7D32"/>
+                <w:sz w:val="18"/>
+                <w:szCs w:val="18"/>
+              </w:rPr>
+              <w:t xml:space="preserve">Corrigé (export, notifications : priorité 2 ; pagination : priorité 3)</w:t>
             </w:r>
           </w:p>
         </w:tc>
@@ -2136,7 +2136,7 @@
           <wp:inline distT="0" distB="0" distL="0" distR="0">
             <wp:extent cx="4476750" cy="800100"/>
             <wp:effectExtent t="0" r="0" b="0" l="0"/>
-            <wp:docPr id="1" name="kpi_before.png" descr="kpi_before.png" title="kpi_before.png"/>
+            <wp:docPr id="2" name="kpi_before.png" descr="kpi_before.png" title="kpi_before.png"/>
             <wp:cNvGraphicFramePr>
               <a:graphicFrameLocks xmlns:a="http://schemas.openxmlformats.org/drawingml/2006/main" noChangeAspect="1"/>
             </wp:cNvGraphicFramePr>
@@ -2200,7 +2200,7 @@
           <wp:inline distT="0" distB="0" distL="0" distR="0">
             <wp:extent cx="4476750" cy="866775"/>
             <wp:effectExtent t="0" r="0" b="0" l="0"/>
-            <wp:docPr id="1" name="kpi_after.png" descr="kpi_after.png" title="kpi_after.png"/>
+            <wp:docPr id="3" name="kpi_after.png" descr="kpi_after.png" title="kpi_after.png"/>
             <wp:cNvGraphicFramePr>
               <a:graphicFrameLocks xmlns:a="http://schemas.openxmlformats.org/drawingml/2006/main" noChangeAspect="1"/>
             </wp:cNvGraphicFramePr>
@@ -2308,7 +2308,7 @@
           <wp:inline distT="0" distB="0" distL="0" distR="0">
             <wp:extent cx="4476750" cy="933450"/>
             <wp:effectExtent t="0" r="0" b="0" l="0"/>
-            <wp:docPr id="1" name="fiche_before.png" descr="fiche_before.png" title="fiche_before.png"/>
+            <wp:docPr id="4" name="fiche_before.png" descr="fiche_before.png" title="fiche_before.png"/>
             <wp:cNvGraphicFramePr>
               <a:graphicFrameLocks xmlns:a="http://schemas.openxmlformats.org/drawingml/2006/main" noChangeAspect="1"/>
             </wp:cNvGraphicFramePr>
@@ -2372,7 +2372,7 @@
           <wp:inline distT="0" distB="0" distL="0" distR="0">
             <wp:extent cx="4476750" cy="942975"/>
             <wp:effectExtent t="0" r="0" b="0" l="0"/>
-            <wp:docPr id="1" name="fiche_after.png" descr="fiche_after.png" title="fiche_after.png"/>
+            <wp:docPr id="5" name="fiche_after.png" descr="fiche_after.png" title="fiche_after.png"/>
             <wp:cNvGraphicFramePr>
               <a:graphicFrameLocks xmlns:a="http://schemas.openxmlformats.org/drawingml/2006/main" noChangeAspect="1"/>
             </wp:cNvGraphicFramePr>
@@ -2629,7 +2629,7 @@
           <wp:inline distT="0" distB="0" distL="0" distR="0">
             <wp:extent cx="4476750" cy="1933575"/>
             <wp:effectExtent t="0" r="0" b="0" l="0"/>
-            <wp:docPr id="1" name="list_before.png" descr="list_before.png" title="list_before.png"/>
+            <wp:docPr id="6" name="list_before.png" descr="list_before.png" title="list_before.png"/>
             <wp:cNvGraphicFramePr>
               <a:graphicFrameLocks xmlns:a="http://schemas.openxmlformats.org/drawingml/2006/main" noChangeAspect="1"/>
             </wp:cNvGraphicFramePr>
@@ -2693,7 +2693,7 @@
           <wp:inline distT="0" distB="0" distL="0" distR="0">
             <wp:extent cx="4476750" cy="1962150"/>
             <wp:effectExtent t="0" r="0" b="0" l="0"/>
-            <wp:docPr id="1" name="list_after.png" descr="list_after.png" title="list_after.png"/>
+            <wp:docPr id="7" name="list_after.png" descr="list_after.png" title="list_after.png"/>
             <wp:cNvGraphicFramePr>
               <a:graphicFrameLocks xmlns:a="http://schemas.openxmlformats.org/drawingml/2006/main" noChangeAspect="1"/>
             </wp:cNvGraphicFramePr>
@@ -2801,7 +2801,7 @@
           <wp:inline distT="0" distB="0" distL="0" distR="0">
             <wp:extent cx="4476750" cy="1247775"/>
             <wp:effectExtent t="0" r="0" b="0" l="0"/>
-            <wp:docPr id="1" name="suivi_after.png" descr="suivi_after.png" title="suivi_after.png"/>
+            <wp:docPr id="8" name="suivi_after.png" descr="suivi_after.png" title="suivi_after.png"/>
             <wp:cNvGraphicFramePr>
               <a:graphicFrameLocks xmlns:a="http://schemas.openxmlformats.org/drawingml/2006/main" noChangeAspect="1"/>
             </wp:cNvGraphicFramePr>
@@ -2946,7 +2946,7 @@
         <w:pStyle w:val="Heading1"/>
       </w:pPr>
       <w:r>
-        <w:t xml:space="preserve">5. Feuille de route recommandée</w:t>
+        <w:t xml:space="preserve">5. Feuille de route</w:t>
       </w:r>
     </w:p>
     <w:p>
@@ -2959,7 +2959,7 @@
           <w:sz w:val="21"/>
           <w:szCs w:val="21"/>
         </w:rPr>
-        <w:t xml:space="preserve">Les priorités 1 et 2 ont été réalisées (sections 6 et 7). Reste la priorité 3 :</w:t>
+        <w:t xml:space="preserve">Les trois niveaux de priorité ont été réalisés (sections 6, 7 et 8) :</w:t>
       </w:r>
     </w:p>
     <w:tbl>
@@ -2976,8 +2976,8 @@
       </w:tblPr>
       <w:tblGrid>
         <w:gridCol w:w="1000"/>
-        <w:gridCol w:w="4838"/>
-        <w:gridCol w:w="3800"/>
+        <w:gridCol w:w="7438"/>
+        <w:gridCol w:w="1200"/>
       </w:tblGrid>
       <w:tr>
         <w:trPr>
@@ -3014,7 +3014,7 @@
         </w:tc>
         <w:tc>
           <w:tcPr>
-            <w:tcW w:type="dxa" w:w="4838"/>
+            <w:tcW w:type="dxa" w:w="7438"/>
             <w:shd w:fill="2E5496" w:color="auto" w:val="clear"/>
             <w:tcMar>
               <w:top w:type="dxa" w:w="40"/>
@@ -3042,7 +3042,7 @@
         </w:tc>
         <w:tc>
           <w:tcPr>
-            <w:tcW w:type="dxa" w:w="3800"/>
+            <w:tcW w:type="dxa" w:w="1200"/>
             <w:shd w:fill="2E5496" w:color="auto" w:val="clear"/>
             <w:tcMar>
               <w:top w:type="dxa" w:w="40"/>
@@ -3064,7 +3064,7 @@
                 <w:sz w:val="18"/>
                 <w:szCs w:val="18"/>
               </w:rPr>
-              <w:t xml:space="preserve">Pourquoi</w:t>
+              <w:t xml:space="preserve">Section</w:t>
             </w:r>
           </w:p>
         </w:tc>
@@ -3096,59 +3096,60 @@
                 <w:sz w:val="18"/>
                 <w:szCs w:val="18"/>
               </w:rPr>
-              <w:t xml:space="preserve">3</w:t>
-            </w:r>
-          </w:p>
-        </w:tc>
-        <w:tc>
-          <w:tcPr>
-            <w:tcW w:type="dxa" w:w="4838"/>
-            <w:tcMar>
-              <w:top w:type="dxa" w:w="40"/>
-              <w:left w:type="dxa" w:w="80"/>
-              <w:bottom w:type="dxa" w:w="40"/>
-              <w:right w:type="dxa" w:w="80"/>
-            </w:tcMar>
-          </w:tcPr>
-          <w:p>
-            <w:pPr>
-              <w:spacing w:after="0" w:line="240"/>
-            </w:pPr>
-            <w:r>
-              <w:rPr>
-                <w:rFonts w:ascii="Calibri" w:cs="Calibri" w:eastAsia="Calibri" w:hAnsi="Calibri"/>
-                <w:b w:val="false"/>
-                <w:bCs w:val="false"/>
-                <w:sz w:val="18"/>
-                <w:szCs w:val="18"/>
-              </w:rPr>
-              <w:t xml:space="preserve">Pagination et filtres côté base de données quand le portefeuille dépassera quelques centaines de dossiers (aujourd'hui, la liste est filtrée en mémoire).</w:t>
-            </w:r>
-          </w:p>
-        </w:tc>
-        <w:tc>
-          <w:tcPr>
-            <w:tcW w:type="dxa" w:w="3800"/>
-            <w:tcMar>
-              <w:top w:type="dxa" w:w="40"/>
-              <w:left w:type="dxa" w:w="80"/>
-              <w:bottom w:type="dxa" w:w="40"/>
-              <w:right w:type="dxa" w:w="80"/>
-            </w:tcMar>
-          </w:tcPr>
-          <w:p>
-            <w:pPr>
-              <w:spacing w:after="0" w:line="240"/>
-            </w:pPr>
-            <w:r>
-              <w:rPr>
-                <w:rFonts w:ascii="Calibri" w:cs="Calibri" w:eastAsia="Calibri" w:hAnsi="Calibri"/>
-                <w:b w:val="false"/>
-                <w:bCs w:val="false"/>
-                <w:sz w:val="18"/>
-                <w:szCs w:val="18"/>
-              </w:rPr>
-              <w:t xml:space="preserve">Performance.</w:t>
+              <w:t xml:space="preserve">1</w:t>
+            </w:r>
+          </w:p>
+        </w:tc>
+        <w:tc>
+          <w:tcPr>
+            <w:tcW w:type="dxa" w:w="7438"/>
+            <w:tcMar>
+              <w:top w:type="dxa" w:w="40"/>
+              <w:left w:type="dxa" w:w="80"/>
+              <w:bottom w:type="dxa" w:w="40"/>
+              <w:right w:type="dxa" w:w="80"/>
+            </w:tcMar>
+          </w:tcPr>
+          <w:p>
+            <w:pPr>
+              <w:spacing w:after="0" w:line="240"/>
+            </w:pPr>
+            <w:r>
+              <w:rPr>
+                <w:rFonts w:ascii="Calibri" w:cs="Calibri" w:eastAsia="Calibri" w:hAnsi="Calibri"/>
+                <w:b w:val="false"/>
+                <w:bCs w:val="false"/>
+                <w:sz w:val="18"/>
+                <w:szCs w:val="18"/>
+              </w:rPr>
+              <w:t xml:space="preserve">Migrations rejouables sur base vierge ; composants de formulaire communs ; fiche projet regroupée.</w:t>
+            </w:r>
+          </w:p>
+        </w:tc>
+        <w:tc>
+          <w:tcPr>
+            <w:tcW w:type="dxa" w:w="1200"/>
+            <w:tcMar>
+              <w:top w:type="dxa" w:w="40"/>
+              <w:left w:type="dxa" w:w="80"/>
+              <w:bottom w:type="dxa" w:w="40"/>
+              <w:right w:type="dxa" w:w="80"/>
+            </w:tcMar>
+          </w:tcPr>
+          <w:p>
+            <w:pPr>
+              <w:spacing w:after="0" w:line="240"/>
+              <w:jc w:val="center"/>
+            </w:pPr>
+            <w:r>
+              <w:rPr>
+                <w:rFonts w:ascii="Calibri" w:cs="Calibri" w:eastAsia="Calibri" w:hAnsi="Calibri"/>
+                <w:b w:val="false"/>
+                <w:bCs w:val="false"/>
+                <w:sz w:val="18"/>
+                <w:szCs w:val="18"/>
+              </w:rPr>
+              <w:t xml:space="preserve">6</w:t>
             </w:r>
           </w:p>
         </w:tc>
@@ -3181,13 +3182,13 @@
                 <w:sz w:val="18"/>
                 <w:szCs w:val="18"/>
               </w:rPr>
-              <w:t xml:space="preserve">3</w:t>
-            </w:r>
-          </w:p>
-        </w:tc>
-        <w:tc>
-          <w:tcPr>
-            <w:tcW w:type="dxa" w:w="4838"/>
+              <w:t xml:space="preserve">2</w:t>
+            </w:r>
+          </w:p>
+        </w:tc>
+        <w:tc>
+          <w:tcPr>
+            <w:tcW w:type="dxa" w:w="7438"/>
             <w:shd w:fill="F2F5FB" w:color="auto" w:val="clear"/>
             <w:tcMar>
               <w:top w:type="dxa" w:w="40"/>
@@ -3208,13 +3209,13 @@
                 <w:sz w:val="18"/>
                 <w:szCs w:val="18"/>
               </w:rPr>
-              <w:t xml:space="preserve">Mode sombre (les tons sémantiques et les styles de champ centralisés le rendent possible).</w:t>
-            </w:r>
-          </w:p>
-        </w:tc>
-        <w:tc>
-          <w:tcPr>
-            <w:tcW w:type="dxa" w:w="3800"/>
+              <w:t xml:space="preserve">Indicateurs cliquables ; export de la liste filtrée ; alertes &amp; échéances ; confirmations intégrées ; champs harmonisés.</w:t>
+            </w:r>
+          </w:p>
+        </w:tc>
+        <w:tc>
+          <w:tcPr>
+            <w:tcW w:type="dxa" w:w="1200"/>
             <w:shd w:fill="F2F5FB" w:color="auto" w:val="clear"/>
             <w:tcMar>
               <w:top w:type="dxa" w:w="40"/>
@@ -3226,16 +3227,17 @@
           <w:p>
             <w:pPr>
               <w:spacing w:after="0" w:line="240"/>
-            </w:pPr>
-            <w:r>
-              <w:rPr>
-                <w:rFonts w:ascii="Calibri" w:cs="Calibri" w:eastAsia="Calibri" w:hAnsi="Calibri"/>
-                <w:b w:val="false"/>
-                <w:bCs w:val="false"/>
-                <w:sz w:val="18"/>
-                <w:szCs w:val="18"/>
-              </w:rPr>
-              <w:t xml:space="preserve">Confort, usage prolongé.</w:t>
+              <w:jc w:val="center"/>
+            </w:pPr>
+            <w:r>
+              <w:rPr>
+                <w:rFonts w:ascii="Calibri" w:cs="Calibri" w:eastAsia="Calibri" w:hAnsi="Calibri"/>
+                <w:b w:val="false"/>
+                <w:bCs w:val="false"/>
+                <w:sz w:val="18"/>
+                <w:szCs w:val="18"/>
+              </w:rPr>
+              <w:t xml:space="preserve">7</w:t>
             </w:r>
           </w:p>
         </w:tc>
@@ -3273,65 +3275,33 @@
         </w:tc>
         <w:tc>
           <w:tcPr>
-            <w:tcW w:type="dxa" w:w="4838"/>
-            <w:tcMar>
-              <w:top w:type="dxa" w:w="40"/>
-              <w:left w:type="dxa" w:w="80"/>
-              <w:bottom w:type="dxa" w:w="40"/>
-              <w:right w:type="dxa" w:w="80"/>
-            </w:tcMar>
-          </w:tcPr>
-          <w:p>
-            <w:pPr>
-              <w:spacing w:after="0" w:line="240"/>
-            </w:pPr>
-            <w:r>
-              <w:rPr>
-                <w:rFonts w:ascii="Calibri" w:cs="Calibri" w:eastAsia="Calibri" w:hAnsi="Calibri"/>
-                <w:b w:val="false"/>
-                <w:bCs w:val="false"/>
-                <w:sz w:val="18"/>
-                <w:szCs w:val="18"/>
-              </w:rPr>
-              <w:t xml:space="preserve">Tests de bout en bout (Playwright) à partir du banc de captures utilisé pour ce diagnostic.</w:t>
-            </w:r>
-          </w:p>
-        </w:tc>
-        <w:tc>
-          <w:tcPr>
-            <w:tcW w:type="dxa" w:w="3800"/>
-            <w:tcMar>
-              <w:top w:type="dxa" w:w="40"/>
-              <w:left w:type="dxa" w:w="80"/>
-              <w:bottom w:type="dxa" w:w="40"/>
-              <w:right w:type="dxa" w:w="80"/>
-            </w:tcMar>
-          </w:tcPr>
-          <w:p>
-            <w:pPr>
-              <w:spacing w:after="0" w:line="240"/>
-            </w:pPr>
-            <w:r>
-              <w:rPr>
-                <w:rFonts w:ascii="Calibri" w:cs="Calibri" w:eastAsia="Calibri" w:hAnsi="Calibri"/>
-                <w:b w:val="false"/>
-                <w:bCs w:val="false"/>
-                <w:sz w:val="18"/>
-                <w:szCs w:val="18"/>
-              </w:rPr>
-              <w:t xml:space="preserve">Non-régression visuelle et fonctionnelle.</w:t>
-            </w:r>
-          </w:p>
-        </w:tc>
-      </w:tr>
-      <w:tr>
-        <w:trPr>
-          <w:cantSplit/>
-        </w:trPr>
-        <w:tc>
-          <w:tcPr>
-            <w:tcW w:type="dxa" w:w="1000"/>
-            <w:shd w:fill="F2F5FB" w:color="auto" w:val="clear"/>
+            <w:tcW w:type="dxa" w:w="7438"/>
+            <w:tcMar>
+              <w:top w:type="dxa" w:w="40"/>
+              <w:left w:type="dxa" w:w="80"/>
+              <w:bottom w:type="dxa" w:w="40"/>
+              <w:right w:type="dxa" w:w="80"/>
+            </w:tcMar>
+          </w:tcPr>
+          <w:p>
+            <w:pPr>
+              <w:spacing w:after="0" w:line="240"/>
+            </w:pPr>
+            <w:r>
+              <w:rPr>
+                <w:rFonts w:ascii="Calibri" w:cs="Calibri" w:eastAsia="Calibri" w:hAnsi="Calibri"/>
+                <w:b w:val="false"/>
+                <w:bCs w:val="false"/>
+                <w:sz w:val="18"/>
+                <w:szCs w:val="18"/>
+              </w:rPr>
+              <w:t xml:space="preserve">Pagination et filtres côté base ; mode sombre ; résumé hebdomadaire des alertes par e-mail ; tests de bout en bout.</w:t>
+            </w:r>
+          </w:p>
+        </w:tc>
+        <w:tc>
+          <w:tcPr>
+            <w:tcW w:type="dxa" w:w="1200"/>
             <w:tcMar>
               <w:top w:type="dxa" w:w="40"/>
               <w:left w:type="dxa" w:w="80"/>
@@ -3347,71 +3317,30 @@
             <w:r>
               <w:rPr>
                 <w:rFonts w:ascii="Calibri" w:cs="Calibri" w:eastAsia="Calibri" w:hAnsi="Calibri"/>
-                <w:b/>
-                <w:bCs/>
-                <w:sz w:val="18"/>
-                <w:szCs w:val="18"/>
-              </w:rPr>
-              <w:t xml:space="preserve">3</w:t>
-            </w:r>
-          </w:p>
-        </w:tc>
-        <w:tc>
-          <w:tcPr>
-            <w:tcW w:type="dxa" w:w="4838"/>
-            <w:shd w:fill="F2F5FB" w:color="auto" w:val="clear"/>
-            <w:tcMar>
-              <w:top w:type="dxa" w:w="40"/>
-              <w:left w:type="dxa" w:w="80"/>
-              <w:bottom w:type="dxa" w:w="40"/>
-              <w:right w:type="dxa" w:w="80"/>
-            </w:tcMar>
-          </w:tcPr>
-          <w:p>
-            <w:pPr>
-              <w:spacing w:after="0" w:line="240"/>
-            </w:pPr>
-            <w:r>
-              <w:rPr>
-                <w:rFonts w:ascii="Calibri" w:cs="Calibri" w:eastAsia="Calibri" w:hAnsi="Calibri"/>
-                <w:b w:val="false"/>
-                <w:bCs w:val="false"/>
-                <w:sz w:val="18"/>
-                <w:szCs w:val="18"/>
-              </w:rPr>
-              <w:t xml:space="preserve">Envoi des alertes par e-mail (résumé hebdomadaire par chargé d'affaires).</w:t>
-            </w:r>
-          </w:p>
-        </w:tc>
-        <w:tc>
-          <w:tcPr>
-            <w:tcW w:type="dxa" w:w="3800"/>
-            <w:shd w:fill="F2F5FB" w:color="auto" w:val="clear"/>
-            <w:tcMar>
-              <w:top w:type="dxa" w:w="40"/>
-              <w:left w:type="dxa" w:w="80"/>
-              <w:bottom w:type="dxa" w:w="40"/>
-              <w:right w:type="dxa" w:w="80"/>
-            </w:tcMar>
-          </w:tcPr>
-          <w:p>
-            <w:pPr>
-              <w:spacing w:after="0" w:line="240"/>
-            </w:pPr>
-            <w:r>
-              <w:rPr>
-                <w:rFonts w:ascii="Calibri" w:cs="Calibri" w:eastAsia="Calibri" w:hAnsi="Calibri"/>
-                <w:b w:val="false"/>
-                <w:bCs w:val="false"/>
-                <w:sz w:val="18"/>
-                <w:szCs w:val="18"/>
-              </w:rPr>
-              <w:t xml:space="preserve">Les alertes sont aujourd'hui consultées dans l'application.</w:t>
+                <w:b w:val="false"/>
+                <w:bCs w:val="false"/>
+                <w:sz w:val="18"/>
+                <w:szCs w:val="18"/>
+              </w:rPr>
+              <w:t xml:space="preserve">8</w:t>
             </w:r>
           </w:p>
         </w:tc>
       </w:tr>
     </w:tbl>
+    <w:p>
+      <w:pPr>
+        <w:spacing w:after="120" w:before="120" w:line="276"/>
+      </w:pPr>
+      <w:r>
+        <w:rPr>
+          <w:rFonts w:ascii="Calibri" w:cs="Calibri" w:eastAsia="Calibri" w:hAnsi="Calibri"/>
+          <w:sz w:val="21"/>
+          <w:szCs w:val="21"/>
+        </w:rPr>
+        <w:t xml:space="preserve">Suites possibles, non engagées : préférence individuelle d'abonnement au résumé (nécessite une colonne en base), relais SMTP interne si la banque n'utilise pas de fournisseur d'e-mail externe, index composites (projet, date) sur les runs au-delà de quelques milliers de dossiers.</w:t>
+      </w:r>
+    </w:p>
     <w:p>
       <w:r>
         <w:br w:type="page"/>
@@ -3647,7 +3576,7 @@
           <wp:inline distT="0" distB="0" distL="0" distR="0">
             <wp:extent cx="4476750" cy="1619250"/>
             <wp:effectExtent t="0" r="0" b="0" l="0"/>
-            <wp:docPr id="1" name="p1_form_error.png" descr="p1_form_error.png" title="p1_form_error.png"/>
+            <wp:docPr id="9" name="p1_form_error.png" descr="p1_form_error.png" title="p1_form_error.png"/>
             <wp:cNvGraphicFramePr>
               <a:graphicFrameLocks xmlns:a="http://schemas.openxmlformats.org/drawingml/2006/main" noChangeAspect="1"/>
             </wp:cNvGraphicFramePr>
@@ -3711,7 +3640,7 @@
           <wp:inline distT="0" distB="0" distL="0" distR="0">
             <wp:extent cx="4476750" cy="1838325"/>
             <wp:effectExtent t="0" r="0" b="0" l="0"/>
-            <wp:docPr id="1" name="p1_wizard.png" descr="p1_wizard.png" title="p1_wizard.png"/>
+            <wp:docPr id="10" name="p1_wizard.png" descr="p1_wizard.png" title="p1_wizard.png"/>
             <wp:cNvGraphicFramePr>
               <a:graphicFrameLocks xmlns:a="http://schemas.openxmlformats.org/drawingml/2006/main" noChangeAspect="1"/>
             </wp:cNvGraphicFramePr>
@@ -3856,7 +3785,7 @@
           <wp:inline distT="0" distB="0" distL="0" distR="0">
             <wp:extent cx="4476750" cy="3248025"/>
             <wp:effectExtent t="0" r="0" b="0" l="0"/>
-            <wp:docPr id="1" name="p1_fiche.png" descr="p1_fiche.png" title="p1_fiche.png"/>
+            <wp:docPr id="11" name="p1_fiche.png" descr="p1_fiche.png" title="p1_fiche.png"/>
             <wp:cNvGraphicFramePr>
               <a:graphicFrameLocks xmlns:a="http://schemas.openxmlformats.org/drawingml/2006/main" noChangeAspect="1"/>
             </wp:cNvGraphicFramePr>
@@ -4041,7 +3970,7 @@
           <wp:inline distT="0" distB="0" distL="0" distR="0">
             <wp:extent cx="4476750" cy="1590675"/>
             <wp:effectExtent t="0" r="0" b="0" l="0"/>
-            <wp:docPr id="1" name="p2_export.png" descr="p2_export.png" title="p2_export.png"/>
+            <wp:docPr id="12" name="p2_export.png" descr="p2_export.png" title="p2_export.png"/>
             <wp:cNvGraphicFramePr>
               <a:graphicFrameLocks xmlns:a="http://schemas.openxmlformats.org/drawingml/2006/main" noChangeAspect="1"/>
             </wp:cNvGraphicFramePr>
@@ -4186,7 +4115,7 @@
           <wp:inline distT="0" distB="0" distL="0" distR="0">
             <wp:extent cx="4476750" cy="2266950"/>
             <wp:effectExtent t="0" r="0" b="0" l="0"/>
-            <wp:docPr id="1" name="p2_dashboard.png" descr="p2_dashboard.png" title="p2_dashboard.png"/>
+            <wp:docPr id="13" name="p2_dashboard.png" descr="p2_dashboard.png" title="p2_dashboard.png"/>
             <wp:cNvGraphicFramePr>
               <a:graphicFrameLocks xmlns:a="http://schemas.openxmlformats.org/drawingml/2006/main" noChangeAspect="1"/>
             </wp:cNvGraphicFramePr>
@@ -4250,7 +4179,7 @@
           <wp:inline distT="0" distB="0" distL="0" distR="0">
             <wp:extent cx="4476750" cy="2419350"/>
             <wp:effectExtent t="0" r="0" b="0" l="0"/>
-            <wp:docPr id="1" name="p2_alerts.png" descr="p2_alerts.png" title="p2_alerts.png"/>
+            <wp:docPr id="14" name="p2_alerts.png" descr="p2_alerts.png" title="p2_alerts.png"/>
             <wp:cNvGraphicFramePr>
               <a:graphicFrameLocks xmlns:a="http://schemas.openxmlformats.org/drawingml/2006/main" noChangeAspect="1"/>
             </wp:cNvGraphicFramePr>
@@ -4377,7 +4306,7 @@
           <wp:inline distT="0" distB="0" distL="0" distR="0">
             <wp:extent cx="4191000" cy="1266825"/>
             <wp:effectExtent t="0" r="0" b="0" l="0"/>
-            <wp:docPr id="1" name="p2_confirm.png" descr="p2_confirm.png" title="p2_confirm.png"/>
+            <wp:docPr id="15" name="p2_confirm.png" descr="p2_confirm.png" title="p2_confirm.png"/>
             <wp:cNvGraphicFramePr>
               <a:graphicFrameLocks xmlns:a="http://schemas.openxmlformats.org/drawingml/2006/main" noChangeAspect="1"/>
             </wp:cNvGraphicFramePr>
@@ -4503,6 +4432,1328 @@
         <w:pStyle w:val="Heading1"/>
       </w:pPr>
       <w:r>
+        <w:t xml:space="preserve">8. Priorité 3 réalisée</w:t>
+      </w:r>
+    </w:p>
+    <w:p>
+      <w:pPr>
+        <w:pStyle w:val="Heading2"/>
+        <w:keepNext/>
+      </w:pPr>
+      <w:r>
+        <w:t xml:space="preserve">8.1 Pagination et filtres exécutés par la base</w:t>
+      </w:r>
+    </w:p>
+    <w:p>
+      <w:pPr>
+        <w:pStyle w:val="ListParagraph"/>
+        <w:numPr>
+          <w:ilvl w:val="0"/>
+          <w:numId w:val="2"/>
+        </w:numPr>
+        <w:spacing w:after="60" w:line="276"/>
+      </w:pPr>
+      <w:r>
+        <w:rPr>
+          <w:rFonts w:ascii="Calibri" w:cs="Calibri" w:eastAsia="Calibri" w:hAnsi="Calibri"/>
+          <w:sz w:val="21"/>
+          <w:szCs w:val="21"/>
+        </w:rPr>
+        <w:t xml:space="preserve">La liste des projets n'est plus chargée entièrement puis filtrée en mémoire : recherche, filtres, tri et pagination sont exécutés par PostgreSQL, en une requête paramétrée (dernier score, dernière classe et étape du circuit obtenus par jointure latérale).</w:t>
+      </w:r>
+    </w:p>
+    <w:p>
+      <w:pPr>
+        <w:pStyle w:val="ListParagraph"/>
+        <w:numPr>
+          <w:ilvl w:val="0"/>
+          <w:numId w:val="2"/>
+        </w:numPr>
+        <w:spacing w:after="60" w:line="276"/>
+      </w:pPr>
+      <w:r>
+        <w:rPr>
+          <w:rFonts w:ascii="Calibri" w:cs="Calibri" w:eastAsia="Calibri" w:hAnsi="Calibri"/>
+          <w:sz w:val="21"/>
+          <w:szCs w:val="21"/>
+        </w:rPr>
+        <w:t xml:space="preserve">Recherche insensible aux accents et à la casse, sans extension de base (repli des accents par translate) ; caractères spéciaux de la recherche neutralisés.</w:t>
+      </w:r>
+    </w:p>
+    <w:p>
+      <w:pPr>
+        <w:pStyle w:val="ListParagraph"/>
+        <w:numPr>
+          <w:ilvl w:val="0"/>
+          <w:numId w:val="2"/>
+        </w:numPr>
+        <w:spacing w:after="60" w:line="276"/>
+      </w:pPr>
+      <w:r>
+        <w:rPr>
+          <w:rFonts w:ascii="Calibri" w:cs="Calibri" w:eastAsia="Calibri" w:hAnsi="Calibri"/>
+          <w:sz w:val="21"/>
+          <w:szCs w:val="21"/>
+        </w:rPr>
+        <w:t xml:space="preserve">Filtre « À rafraîchir » calculé en SQL avec les règles de la politique de revue : jamais scoré, périodicité de la classe atteinte (365 j sain, 90 j sensible, 30 j au-delà), ou événement matériel / imposant un comité postérieur au dernier score.</w:t>
+      </w:r>
+    </w:p>
+    <w:p>
+      <w:pPr>
+        <w:pStyle w:val="ListParagraph"/>
+        <w:numPr>
+          <w:ilvl w:val="0"/>
+          <w:numId w:val="2"/>
+        </w:numPr>
+        <w:spacing w:after="60" w:line="276"/>
+      </w:pPr>
+      <w:r>
+        <w:rPr>
+          <w:rFonts w:ascii="Calibri" w:cs="Calibri" w:eastAsia="Calibri" w:hAnsi="Calibri"/>
+          <w:sz w:val="21"/>
+          <w:szCs w:val="21"/>
+        </w:rPr>
+        <w:t xml:space="preserve">25, 50 ou 100 dossiers par page ; navigation précédente / suivante et numéros de page (liens : fonctionne sans JavaScript) ; une page au-delà de la dernière affiche la dernière. Le nombre de dossiers et l'exposition portent sur tout le filtre.</w:t>
+      </w:r>
+    </w:p>
+    <w:p>
+      <w:pPr>
+        <w:pStyle w:val="ListParagraph"/>
+        <w:numPr>
+          <w:ilvl w:val="0"/>
+          <w:numId w:val="2"/>
+        </w:numPr>
+        <w:spacing w:after="60" w:line="276"/>
+      </w:pPr>
+      <w:r>
+        <w:rPr>
+          <w:rFonts w:ascii="Calibri" w:cs="Calibri" w:eastAsia="Calibri" w:hAnsi="Calibri"/>
+          <w:sz w:val="21"/>
+          <w:szCs w:val="21"/>
+        </w:rPr>
+        <w:t xml:space="preserve">L'export Excel / CSV utilise la même requête, sans pagination : il contient toute la liste filtrée.</w:t>
+      </w:r>
+    </w:p>
+    <w:p>
+      <w:pPr>
+        <w:pStyle w:val="ListParagraph"/>
+        <w:numPr>
+          <w:ilvl w:val="0"/>
+          <w:numId w:val="2"/>
+        </w:numPr>
+        <w:spacing w:after="60" w:line="276"/>
+      </w:pPr>
+      <w:r>
+        <w:rPr>
+          <w:rFonts w:ascii="Calibri" w:cs="Calibri" w:eastAsia="Calibri" w:hAnsi="Calibri"/>
+          <w:sz w:val="21"/>
+          <w:szCs w:val="21"/>
+        </w:rPr>
+        <w:t xml:space="preserve">Contrôle : 4 tests d'intégration sur une base PostgreSQL réelle vérifient, sur 30 combinaisons de filtres et de tris, que la base renvoie exactement la liste de la définition de référence, que l'indicateur « à rafraîchir » coïncide avec la file de re-scoring, et que les pages enchaînées redonnent la liste complète, sans perte ni doublon. Ils passent sur la base de test (32 dossiers) et sur la base de démonstration.</w:t>
+      </w:r>
+    </w:p>
+    <w:p>
+      <w:pPr>
+        <w:keepNext/>
+        <w:spacing w:after="40" w:before="60"/>
+        <w:jc w:val="center"/>
+      </w:pPr>
+      <w:r>
+        <w:drawing>
+          <wp:inline distT="0" distB="0" distL="0" distR="0">
+            <wp:extent cx="4476750" cy="2800350"/>
+            <wp:effectExtent t="0" r="0" b="0" l="0"/>
+            <wp:docPr id="16" name="p3_pagination.png" descr="p3_pagination.png" title="p3_pagination.png"/>
+            <wp:cNvGraphicFramePr>
+              <a:graphicFrameLocks xmlns:a="http://schemas.openxmlformats.org/drawingml/2006/main" noChangeAspect="1"/>
+            </wp:cNvGraphicFramePr>
+            <a:graphic xmlns:a="http://schemas.openxmlformats.org/drawingml/2006/main">
+              <a:graphicData uri="http://schemas.openxmlformats.org/drawingml/2006/picture">
+                <pic:pic xmlns:pic="http://schemas.openxmlformats.org/drawingml/2006/picture">
+                  <pic:nvPicPr>
+                    <pic:cNvPr id="0" name="" descr=""/>
+                    <pic:cNvPicPr>
+                      <a:picLocks noChangeAspect="1" noChangeArrowheads="1"/>
+                    </pic:cNvPicPr>
+                  </pic:nvPicPr>
+                  <pic:blipFill>
+                    <a:blip r:embed="rId24" cstate="none"/>
+                    <a:srcRect/>
+                    <a:stretch>
+                      <a:fillRect/>
+                    </a:stretch>
+                  </pic:blipFill>
+                  <pic:spPr bwMode="auto">
+                    <a:xfrm>
+                      <a:off x="0" y="0"/>
+                      <a:ext cx="4476750" cy="2800350"/>
+                    </a:xfrm>
+                    <a:prstGeom prst="rect">
+                      <a:avLst/>
+                    </a:prstGeom>
+                  </pic:spPr>
+                </pic:pic>
+              </a:graphicData>
+            </a:graphic>
+          </wp:inline>
+        </w:drawing>
+      </w:r>
+    </w:p>
+    <w:p>
+      <w:pPr>
+        <w:spacing w:after="160" w:before="0" w:line="276"/>
+        <w:jc w:val="center"/>
+      </w:pPr>
+      <w:r>
+        <w:rPr>
+          <w:rFonts w:ascii="Calibri" w:cs="Calibri" w:eastAsia="Calibri" w:hAnsi="Calibri"/>
+          <w:i/>
+          <w:iCs/>
+          <w:color w:val="595959"/>
+          <w:sz w:val="18"/>
+          <w:szCs w:val="18"/>
+        </w:rPr>
+        <w:t xml:space="preserve">Liste des projets, page 2 sur 2 : pagination et choix du nombre de dossiers par page</w:t>
+      </w:r>
+    </w:p>
+    <w:p>
+      <w:pPr>
+        <w:pStyle w:val="Heading2"/>
+        <w:keepNext/>
+      </w:pPr>
+      <w:r>
+        <w:t xml:space="preserve">8.2 Mode sombre</w:t>
+      </w:r>
+    </w:p>
+    <w:p>
+      <w:pPr>
+        <w:pStyle w:val="ListParagraph"/>
+        <w:numPr>
+          <w:ilvl w:val="0"/>
+          <w:numId w:val="2"/>
+        </w:numPr>
+        <w:spacing w:after="60" w:line="276"/>
+      </w:pPr>
+      <w:r>
+        <w:rPr>
+          <w:rFonts w:ascii="Calibri" w:cs="Calibri" w:eastAsia="Calibri" w:hAnsi="Calibri"/>
+          <w:sz w:val="21"/>
+          <w:szCs w:val="21"/>
+        </w:rPr>
+        <w:t xml:space="preserve">Toutes les couleurs passent par des variables CSS : les jetons de l'interface (fond, texte, bordure, primaire, danger) et la palette des tons (badges, bandeaux, graphiques). En sombre, l'échelle de chaque teinte est inversée — les fonds clairs deviennent foncés, les textes foncés deviennent clairs — sans modifier les composants.</w:t>
+      </w:r>
+    </w:p>
+    <w:p>
+      <w:pPr>
+        <w:pStyle w:val="ListParagraph"/>
+        <w:numPr>
+          <w:ilvl w:val="0"/>
+          <w:numId w:val="2"/>
+        </w:numPr>
+        <w:spacing w:after="60" w:line="276"/>
+      </w:pPr>
+      <w:r>
+        <w:rPr>
+          <w:rFonts w:ascii="Calibri" w:cs="Calibri" w:eastAsia="Calibri" w:hAnsi="Calibri"/>
+          <w:sz w:val="21"/>
+          <w:szCs w:val="21"/>
+        </w:rPr>
+        <w:t xml:space="preserve">Choix « Système / Clair / Sombre » en bas de la barre latérale ; par défaut, l'application suit le réglage de l'appareil. Le choix est conservé (cookie) et rendu directement par le serveur : pas de flash clair au chargement.</w:t>
+      </w:r>
+    </w:p>
+    <w:p>
+      <w:pPr>
+        <w:pStyle w:val="ListParagraph"/>
+        <w:numPr>
+          <w:ilvl w:val="0"/>
+          <w:numId w:val="2"/>
+        </w:numPr>
+        <w:spacing w:after="60" w:line="276"/>
+      </w:pPr>
+      <w:r>
+        <w:rPr>
+          <w:rFonts w:ascii="Calibri" w:cs="Calibri" w:eastAsia="Calibri" w:hAnsi="Calibri"/>
+          <w:sz w:val="21"/>
+          <w:szCs w:val="21"/>
+        </w:rPr>
+        <w:t xml:space="preserve">Contrastes vérifiés par test, dans les deux thèmes : texte principal ≥ 7:1, texte secondaire, liens, boutons et tous les tons sémantiques ≥ 4,5:1 (norme WCAG AA). Le texte secondaire du thème clair a été légèrement foncé à cette occasion (4,3:1 → 5,9:1 sur fond gris).</w:t>
+      </w:r>
+    </w:p>
+    <w:p>
+      <w:pPr>
+        <w:pStyle w:val="ListParagraph"/>
+        <w:numPr>
+          <w:ilvl w:val="0"/>
+          <w:numId w:val="2"/>
+        </w:numPr>
+        <w:spacing w:after="60" w:line="276"/>
+      </w:pPr>
+      <w:r>
+        <w:rPr>
+          <w:rFonts w:ascii="Calibri" w:cs="Calibri" w:eastAsia="Calibri" w:hAnsi="Calibri"/>
+          <w:sz w:val="21"/>
+          <w:szCs w:val="21"/>
+        </w:rPr>
+        <w:t xml:space="preserve">Graphiques (graduations, axes, infobulles) et bouton « danger » adaptés ; le thème clair est inchangé par ailleurs.</w:t>
+      </w:r>
+    </w:p>
+    <w:p>
+      <w:pPr>
+        <w:keepNext/>
+        <w:spacing w:after="40" w:before="60"/>
+        <w:jc w:val="center"/>
+      </w:pPr>
+      <w:r>
+        <w:drawing>
+          <wp:inline distT="0" distB="0" distL="0" distR="0">
+            <wp:extent cx="4476750" cy="2800350"/>
+            <wp:effectExtent t="0" r="0" b="0" l="0"/>
+            <wp:docPr id="17" name="p3_dark_dashboard.png" descr="p3_dark_dashboard.png" title="p3_dark_dashboard.png"/>
+            <wp:cNvGraphicFramePr>
+              <a:graphicFrameLocks xmlns:a="http://schemas.openxmlformats.org/drawingml/2006/main" noChangeAspect="1"/>
+            </wp:cNvGraphicFramePr>
+            <a:graphic xmlns:a="http://schemas.openxmlformats.org/drawingml/2006/main">
+              <a:graphicData uri="http://schemas.openxmlformats.org/drawingml/2006/picture">
+                <pic:pic xmlns:pic="http://schemas.openxmlformats.org/drawingml/2006/picture">
+                  <pic:nvPicPr>
+                    <pic:cNvPr id="0" name="" descr=""/>
+                    <pic:cNvPicPr>
+                      <a:picLocks noChangeAspect="1" noChangeArrowheads="1"/>
+                    </pic:cNvPicPr>
+                  </pic:nvPicPr>
+                  <pic:blipFill>
+                    <a:blip r:embed="rId25" cstate="none"/>
+                    <a:srcRect/>
+                    <a:stretch>
+                      <a:fillRect/>
+                    </a:stretch>
+                  </pic:blipFill>
+                  <pic:spPr bwMode="auto">
+                    <a:xfrm>
+                      <a:off x="0" y="0"/>
+                      <a:ext cx="4476750" cy="2800350"/>
+                    </a:xfrm>
+                    <a:prstGeom prst="rect">
+                      <a:avLst/>
+                    </a:prstGeom>
+                  </pic:spPr>
+                </pic:pic>
+              </a:graphicData>
+            </a:graphic>
+          </wp:inline>
+        </w:drawing>
+      </w:r>
+    </w:p>
+    <w:p>
+      <w:pPr>
+        <w:spacing w:after="160" w:before="0" w:line="276"/>
+        <w:jc w:val="center"/>
+      </w:pPr>
+      <w:r>
+        <w:rPr>
+          <w:rFonts w:ascii="Calibri" w:cs="Calibri" w:eastAsia="Calibri" w:hAnsi="Calibri"/>
+          <w:i/>
+          <w:iCs/>
+          <w:color w:val="595959"/>
+          <w:sz w:val="18"/>
+          <w:szCs w:val="18"/>
+        </w:rPr>
+        <w:t xml:space="preserve">Tableau de bord en mode sombre</w:t>
+      </w:r>
+    </w:p>
+    <w:p>
+      <w:pPr>
+        <w:keepNext/>
+        <w:spacing w:after="40" w:before="60"/>
+        <w:jc w:val="center"/>
+      </w:pPr>
+      <w:r>
+        <w:drawing>
+          <wp:inline distT="0" distB="0" distL="0" distR="0">
+            <wp:extent cx="4476750" cy="2800350"/>
+            <wp:effectExtent t="0" r="0" b="0" l="0"/>
+            <wp:docPr id="18" name="p3_dark_fiche.png" descr="p3_dark_fiche.png" title="p3_dark_fiche.png"/>
+            <wp:cNvGraphicFramePr>
+              <a:graphicFrameLocks xmlns:a="http://schemas.openxmlformats.org/drawingml/2006/main" noChangeAspect="1"/>
+            </wp:cNvGraphicFramePr>
+            <a:graphic xmlns:a="http://schemas.openxmlformats.org/drawingml/2006/main">
+              <a:graphicData uri="http://schemas.openxmlformats.org/drawingml/2006/picture">
+                <pic:pic xmlns:pic="http://schemas.openxmlformats.org/drawingml/2006/picture">
+                  <pic:nvPicPr>
+                    <pic:cNvPr id="0" name="" descr=""/>
+                    <pic:cNvPicPr>
+                      <a:picLocks noChangeAspect="1" noChangeArrowheads="1"/>
+                    </pic:cNvPicPr>
+                  </pic:nvPicPr>
+                  <pic:blipFill>
+                    <a:blip r:embed="rId26" cstate="none"/>
+                    <a:srcRect/>
+                    <a:stretch>
+                      <a:fillRect/>
+                    </a:stretch>
+                  </pic:blipFill>
+                  <pic:spPr bwMode="auto">
+                    <a:xfrm>
+                      <a:off x="0" y="0"/>
+                      <a:ext cx="4476750" cy="2800350"/>
+                    </a:xfrm>
+                    <a:prstGeom prst="rect">
+                      <a:avLst/>
+                    </a:prstGeom>
+                  </pic:spPr>
+                </pic:pic>
+              </a:graphicData>
+            </a:graphic>
+          </wp:inline>
+        </w:drawing>
+      </w:r>
+    </w:p>
+    <w:p>
+      <w:pPr>
+        <w:spacing w:after="160" w:before="0" w:line="276"/>
+        <w:jc w:val="center"/>
+      </w:pPr>
+      <w:r>
+        <w:rPr>
+          <w:rFonts w:ascii="Calibri" w:cs="Calibri" w:eastAsia="Calibri" w:hAnsi="Calibri"/>
+          <w:i/>
+          <w:iCs/>
+          <w:color w:val="595959"/>
+          <w:sz w:val="18"/>
+          <w:szCs w:val="18"/>
+        </w:rPr>
+        <w:t xml:space="preserve">Fiche projet en mode sombre</w:t>
+      </w:r>
+    </w:p>
+    <w:p>
+      <w:pPr>
+        <w:keepNext/>
+        <w:spacing w:after="40" w:before="60"/>
+        <w:jc w:val="center"/>
+      </w:pPr>
+      <w:r>
+        <w:drawing>
+          <wp:inline distT="0" distB="0" distL="0" distR="0">
+            <wp:extent cx="1905000" cy="1266825"/>
+            <wp:effectExtent t="0" r="0" b="0" l="0"/>
+            <wp:docPr id="19" name="p3_theme_toggle.png" descr="p3_theme_toggle.png" title="p3_theme_toggle.png"/>
+            <wp:cNvGraphicFramePr>
+              <a:graphicFrameLocks xmlns:a="http://schemas.openxmlformats.org/drawingml/2006/main" noChangeAspect="1"/>
+            </wp:cNvGraphicFramePr>
+            <a:graphic xmlns:a="http://schemas.openxmlformats.org/drawingml/2006/main">
+              <a:graphicData uri="http://schemas.openxmlformats.org/drawingml/2006/picture">
+                <pic:pic xmlns:pic="http://schemas.openxmlformats.org/drawingml/2006/picture">
+                  <pic:nvPicPr>
+                    <pic:cNvPr id="0" name="" descr=""/>
+                    <pic:cNvPicPr>
+                      <a:picLocks noChangeAspect="1" noChangeArrowheads="1"/>
+                    </pic:cNvPicPr>
+                  </pic:nvPicPr>
+                  <pic:blipFill>
+                    <a:blip r:embed="rId27" cstate="none"/>
+                    <a:srcRect/>
+                    <a:stretch>
+                      <a:fillRect/>
+                    </a:stretch>
+                  </pic:blipFill>
+                  <pic:spPr bwMode="auto">
+                    <a:xfrm>
+                      <a:off x="0" y="0"/>
+                      <a:ext cx="1905000" cy="1266825"/>
+                    </a:xfrm>
+                    <a:prstGeom prst="rect">
+                      <a:avLst/>
+                    </a:prstGeom>
+                  </pic:spPr>
+                </pic:pic>
+              </a:graphicData>
+            </a:graphic>
+          </wp:inline>
+        </w:drawing>
+      </w:r>
+    </w:p>
+    <w:p>
+      <w:pPr>
+        <w:spacing w:after="160" w:before="0" w:line="276"/>
+        <w:jc w:val="center"/>
+      </w:pPr>
+      <w:r>
+        <w:rPr>
+          <w:rFonts w:ascii="Calibri" w:cs="Calibri" w:eastAsia="Calibri" w:hAnsi="Calibri"/>
+          <w:i/>
+          <w:iCs/>
+          <w:color w:val="595959"/>
+          <w:sz w:val="18"/>
+          <w:szCs w:val="18"/>
+        </w:rPr>
+        <w:t xml:space="preserve">Sélecteur de thème (barre latérale)</w:t>
+      </w:r>
+    </w:p>
+    <w:p>
+      <w:pPr>
+        <w:keepNext/>
+        <w:spacing w:after="40" w:before="60"/>
+        <w:jc w:val="center"/>
+      </w:pPr>
+      <w:r>
+        <w:drawing>
+          <wp:inline distT="0" distB="0" distL="0" distR="0">
+            <wp:extent cx="2095500" cy="4533900"/>
+            <wp:effectExtent t="0" r="0" b="0" l="0"/>
+            <wp:docPr id="20" name="p3_dark_mobile.png" descr="p3_dark_mobile.png" title="p3_dark_mobile.png"/>
+            <wp:cNvGraphicFramePr>
+              <a:graphicFrameLocks xmlns:a="http://schemas.openxmlformats.org/drawingml/2006/main" noChangeAspect="1"/>
+            </wp:cNvGraphicFramePr>
+            <a:graphic xmlns:a="http://schemas.openxmlformats.org/drawingml/2006/main">
+              <a:graphicData uri="http://schemas.openxmlformats.org/drawingml/2006/picture">
+                <pic:pic xmlns:pic="http://schemas.openxmlformats.org/drawingml/2006/picture">
+                  <pic:nvPicPr>
+                    <pic:cNvPr id="0" name="" descr=""/>
+                    <pic:cNvPicPr>
+                      <a:picLocks noChangeAspect="1" noChangeArrowheads="1"/>
+                    </pic:cNvPicPr>
+                  </pic:nvPicPr>
+                  <pic:blipFill>
+                    <a:blip r:embed="rId28" cstate="none"/>
+                    <a:srcRect/>
+                    <a:stretch>
+                      <a:fillRect/>
+                    </a:stretch>
+                  </pic:blipFill>
+                  <pic:spPr bwMode="auto">
+                    <a:xfrm>
+                      <a:off x="0" y="0"/>
+                      <a:ext cx="2095500" cy="4533900"/>
+                    </a:xfrm>
+                    <a:prstGeom prst="rect">
+                      <a:avLst/>
+                    </a:prstGeom>
+                  </pic:spPr>
+                </pic:pic>
+              </a:graphicData>
+            </a:graphic>
+          </wp:inline>
+        </w:drawing>
+      </w:r>
+    </w:p>
+    <w:p>
+      <w:pPr>
+        <w:spacing w:after="160" w:before="0" w:line="276"/>
+        <w:jc w:val="center"/>
+      </w:pPr>
+      <w:r>
+        <w:rPr>
+          <w:rFonts w:ascii="Calibri" w:cs="Calibri" w:eastAsia="Calibri" w:hAnsi="Calibri"/>
+          <w:i/>
+          <w:iCs/>
+          <w:color w:val="595959"/>
+          <w:sz w:val="18"/>
+          <w:szCs w:val="18"/>
+        </w:rPr>
+        <w:t xml:space="preserve">Liste des projets sur téléphone, en mode sombre</w:t>
+      </w:r>
+    </w:p>
+    <w:p>
+      <w:pPr>
+        <w:pStyle w:val="Heading2"/>
+        <w:keepNext/>
+      </w:pPr>
+      <w:r>
+        <w:t xml:space="preserve">8.3 Résumé hebdomadaire des alertes par e-mail</w:t>
+      </w:r>
+    </w:p>
+    <w:p>
+      <w:pPr>
+        <w:pStyle w:val="ListParagraph"/>
+        <w:numPr>
+          <w:ilvl w:val="0"/>
+          <w:numId w:val="2"/>
+        </w:numPr>
+        <w:spacing w:after="60" w:line="276"/>
+      </w:pPr>
+      <w:r>
+        <w:rPr>
+          <w:rFonts w:ascii="Calibri" w:cs="Calibri" w:eastAsia="Calibri" w:hAnsi="Calibri"/>
+          <w:sz w:val="21"/>
+          <w:szCs w:val="21"/>
+        </w:rPr>
+        <w:t xml:space="preserve">Chaque lundi à 8 h (heure de Casablanca), chaque chargé d'affaires actif ayant au moins une alerte sur ses dossiers reçoit un e-mail : alertes classées par gravité, avec pour chacune le dossier, le motif et un lien direct vers l'endroit où agir, puis un bouton vers la page des alertes. Aucun e-mail quand il n'y a rien à signaler ; 40 alertes détaillées au plus, le reste dans l'application.</w:t>
+      </w:r>
+    </w:p>
+    <w:p>
+      <w:pPr>
+        <w:pStyle w:val="ListParagraph"/>
+        <w:numPr>
+          <w:ilvl w:val="0"/>
+          <w:numId w:val="2"/>
+        </w:numPr>
+        <w:spacing w:after="60" w:line="276"/>
+      </w:pPr>
+      <w:r>
+        <w:rPr>
+          <w:rFonts w:ascii="Calibri" w:cs="Calibri" w:eastAsia="Calibri" w:hAnsi="Calibri"/>
+          <w:sz w:val="21"/>
+          <w:szCs w:val="21"/>
+        </w:rPr>
+        <w:t xml:space="preserve">Mêmes règles que la page « Alertes &amp; échéances » (une seule source). Contenu en texte brut et HTML, compatible avec les messageries ; tout le contenu saisi est échappé.</w:t>
+      </w:r>
+    </w:p>
+    <w:p>
+      <w:pPr>
+        <w:pStyle w:val="ListParagraph"/>
+        <w:numPr>
+          <w:ilvl w:val="0"/>
+          <w:numId w:val="2"/>
+        </w:numPr>
+        <w:spacing w:after="60" w:line="276"/>
+      </w:pPr>
+      <w:r>
+        <w:rPr>
+          <w:rFonts w:ascii="Calibri" w:cs="Calibri" w:eastAsia="Calibri" w:hAnsi="Calibri"/>
+          <w:sz w:val="21"/>
+          <w:szCs w:val="21"/>
+        </w:rPr>
+        <w:t xml:space="preserve">Tâche planifiée Vercel (vercel.json) protégée par un secret (CRON_SECRET, comparaison à temps constant ; sans secret, la tâche est refusée). Envoi par l'API Resend quand RESEND_API_KEY et MAIL_FROM sont renseignés ; sinon, la tâche calcule les résumés sans rien envoyer. Un appel « ?apercu=1 » renvoie le contenu sans envoi. Chaque exécution laisse une trace d'exploitation (nombre de destinataires, d'envois, d'erreurs).</w:t>
+      </w:r>
+    </w:p>
+    <w:p>
+      <w:pPr>
+        <w:pStyle w:val="ListParagraph"/>
+        <w:numPr>
+          <w:ilvl w:val="0"/>
+          <w:numId w:val="2"/>
+        </w:numPr>
+        <w:spacing w:after="60" w:line="276"/>
+      </w:pPr>
+      <w:r>
+        <w:rPr>
+          <w:rFonts w:ascii="Calibri" w:cs="Calibri" w:eastAsia="Calibri" w:hAnsi="Calibri"/>
+          <w:sz w:val="21"/>
+          <w:szCs w:val="21"/>
+        </w:rPr>
+        <w:t xml:space="preserve">Page « Résumé hebdomadaire par e-mail » (depuis Alertes) : aperçu exact de l'e-mail de l'utilisateur, et état de la configuration de l'envoi.</w:t>
+      </w:r>
+    </w:p>
+    <w:p>
+      <w:pPr>
+        <w:pStyle w:val="ListParagraph"/>
+        <w:numPr>
+          <w:ilvl w:val="0"/>
+          <w:numId w:val="2"/>
+        </w:numPr>
+        <w:spacing w:after="60" w:line="276"/>
+      </w:pPr>
+      <w:r>
+        <w:rPr>
+          <w:rFonts w:ascii="Calibri" w:cs="Calibri" w:eastAsia="Calibri" w:hAnsi="Calibri"/>
+          <w:sz w:val="21"/>
+          <w:szCs w:val="21"/>
+        </w:rPr>
+        <w:t xml:space="preserve">Sur la base de test : 1 chargé d'affaires, 14 alertes sur 10 dossiers. 8 tests couvrent le contenu, l'échappement, la limite, l'appel au fournisseur (succès, refus, panne réseau) et le contrôle du secret.</w:t>
+      </w:r>
+    </w:p>
+    <w:p>
+      <w:pPr>
+        <w:keepNext/>
+        <w:spacing w:after="40" w:before="60"/>
+        <w:jc w:val="center"/>
+      </w:pPr>
+      <w:r>
+        <w:drawing>
+          <wp:inline distT="0" distB="0" distL="0" distR="0">
+            <wp:extent cx="3619500" cy="2314575"/>
+            <wp:effectExtent t="0" r="0" b="0" l="0"/>
+            <wp:docPr id="21" name="p3_digest.png" descr="p3_digest.png" title="p3_digest.png"/>
+            <wp:cNvGraphicFramePr>
+              <a:graphicFrameLocks xmlns:a="http://schemas.openxmlformats.org/drawingml/2006/main" noChangeAspect="1"/>
+            </wp:cNvGraphicFramePr>
+            <a:graphic xmlns:a="http://schemas.openxmlformats.org/drawingml/2006/main">
+              <a:graphicData uri="http://schemas.openxmlformats.org/drawingml/2006/picture">
+                <pic:pic xmlns:pic="http://schemas.openxmlformats.org/drawingml/2006/picture">
+                  <pic:nvPicPr>
+                    <pic:cNvPr id="0" name="" descr=""/>
+                    <pic:cNvPicPr>
+                      <a:picLocks noChangeAspect="1" noChangeArrowheads="1"/>
+                    </pic:cNvPicPr>
+                  </pic:nvPicPr>
+                  <pic:blipFill>
+                    <a:blip r:embed="rId29" cstate="none"/>
+                    <a:srcRect/>
+                    <a:stretch>
+                      <a:fillRect/>
+                    </a:stretch>
+                  </pic:blipFill>
+                  <pic:spPr bwMode="auto">
+                    <a:xfrm>
+                      <a:off x="0" y="0"/>
+                      <a:ext cx="3619500" cy="2314575"/>
+                    </a:xfrm>
+                    <a:prstGeom prst="rect">
+                      <a:avLst/>
+                    </a:prstGeom>
+                  </pic:spPr>
+                </pic:pic>
+              </a:graphicData>
+            </a:graphic>
+          </wp:inline>
+        </w:drawing>
+      </w:r>
+    </w:p>
+    <w:p>
+      <w:pPr>
+        <w:spacing w:after="160" w:before="0" w:line="276"/>
+        <w:jc w:val="center"/>
+      </w:pPr>
+      <w:r>
+        <w:rPr>
+          <w:rFonts w:ascii="Calibri" w:cs="Calibri" w:eastAsia="Calibri" w:hAnsi="Calibri"/>
+          <w:i/>
+          <w:iCs/>
+          <w:color w:val="595959"/>
+          <w:sz w:val="18"/>
+          <w:szCs w:val="18"/>
+        </w:rPr>
+        <w:t xml:space="preserve">Aperçu du résumé hebdomadaire d'un chargé d'affaires</w:t>
+      </w:r>
+    </w:p>
+    <w:tbl>
+      <w:tblPr>
+        <w:tblW w:type="dxa" w:w="9638"/>
+        <w:tblBorders>
+          <w:top w:val="single" w:color="B45F06" w:sz="4"/>
+          <w:left w:val="single" w:color="B45F06" w:sz="4"/>
+          <w:bottom w:val="single" w:color="B45F06" w:sz="4"/>
+          <w:right w:val="single" w:color="B45F06" w:sz="4"/>
+          <w:insideH w:val="none"/>
+          <w:insideV w:val="none"/>
+        </w:tblBorders>
+      </w:tblPr>
+      <w:tblGrid>
+        <w:gridCol w:w="9638"/>
+      </w:tblGrid>
+      <w:tr>
+        <w:trPr>
+          <w:cantSplit/>
+        </w:trPr>
+        <w:tc>
+          <w:tcPr>
+            <w:tcW w:type="dxa" w:w="9638"/>
+            <w:shd w:fill="FFF4E5" w:color="auto" w:val="clear"/>
+            <w:tcMar>
+              <w:top w:type="dxa" w:w="100"/>
+              <w:left w:type="dxa" w:w="160"/>
+              <w:bottom w:type="dxa" w:w="100"/>
+              <w:right w:type="dxa" w:w="160"/>
+            </w:tcMar>
+          </w:tcPr>
+          <w:p>
+            <w:pPr>
+              <w:spacing w:after="40"/>
+            </w:pPr>
+            <w:r>
+              <w:rPr>
+                <w:rFonts w:ascii="Calibri" w:cs="Calibri" w:eastAsia="Calibri" w:hAnsi="Calibri"/>
+                <w:b/>
+                <w:bCs/>
+                <w:color w:val="B45F06"/>
+                <w:sz w:val="21"/>
+                <w:szCs w:val="21"/>
+              </w:rPr>
+              <w:t xml:space="preserve">À faire pour activer l'envoi en production</w:t>
+            </w:r>
+          </w:p>
+          <w:p>
+            <w:pPr>
+              <w:spacing w:after="40" w:line="276"/>
+            </w:pPr>
+            <w:r>
+              <w:rPr>
+                <w:rFonts w:ascii="Calibri" w:cs="Calibri" w:eastAsia="Calibri" w:hAnsi="Calibri"/>
+                <w:sz w:val="21"/>
+                <w:szCs w:val="21"/>
+              </w:rPr>
+              <w:t xml:space="preserve">Sur Vercel (Project Settings → Environment Variables) : CRON_SECRET (au moins 16 caractères), RESEND_API_KEY, MAIL_FROM (adresse d'un domaine vérifié chez le fournisseur) et, si le domaine diffère du domaine Vercel, APP_URL.</w:t>
+            </w:r>
+          </w:p>
+          <w:p>
+            <w:pPr>
+              <w:spacing w:after="40" w:line="276"/>
+            </w:pPr>
+            <w:r>
+              <w:rPr>
+                <w:rFonts w:ascii="Calibri" w:cs="Calibri" w:eastAsia="Calibri" w:hAnsi="Calibri"/>
+                <w:sz w:val="21"/>
+                <w:szCs w:val="21"/>
+              </w:rPr>
+              <w:t xml:space="preserve">Sans ces variables, rien n'est envoyé ; la tâche planifiée est refusée tant que CRON_SECRET manque.</w:t>
+            </w:r>
+          </w:p>
+        </w:tc>
+      </w:tr>
+    </w:tbl>
+    <w:p>
+      <w:pPr>
+        <w:pStyle w:val="Heading2"/>
+        <w:keepNext/>
+      </w:pPr>
+      <w:r>
+        <w:t xml:space="preserve">8.4 Tests de bout en bout</w:t>
+      </w:r>
+    </w:p>
+    <w:p>
+      <w:pPr>
+        <w:pStyle w:val="ListParagraph"/>
+        <w:numPr>
+          <w:ilvl w:val="0"/>
+          <w:numId w:val="2"/>
+        </w:numPr>
+        <w:spacing w:after="60" w:line="276"/>
+      </w:pPr>
+      <w:r>
+        <w:rPr>
+          <w:rFonts w:ascii="Calibri" w:cs="Calibri" w:eastAsia="Calibri" w:hAnsi="Calibri"/>
+          <w:sz w:val="21"/>
+          <w:szCs w:val="21"/>
+        </w:rPr>
+        <w:t xml:space="preserve">13 parcours Playwright dans un navigateur réel, sur grand écran et sur téléphone : pagination et taille de page ; recherche sans accents ; filtre « à rafraîchir » et tri par montant ; export CSV de la liste filtrée (toutes pages) ; création d'un projet avec erreurs sous les champs puis enregistrement ; onglets de la fiche par lien direct ; confirmation du rejet (focus sur « Annuler », Échap annule) ; alertes par gravité ; vue d'un chargé d'affaires et aperçu de son résumé ; tâche planifiée refusée sans secret ; bascule clair / sombre conservée ; menu en tiroir et cartes sur mobile.</w:t>
+      </w:r>
+    </w:p>
+    <w:p>
+      <w:pPr>
+        <w:pStyle w:val="ListParagraph"/>
+        <w:numPr>
+          <w:ilvl w:val="0"/>
+          <w:numId w:val="2"/>
+        </w:numPr>
+        <w:spacing w:after="60" w:line="276"/>
+      </w:pPr>
+      <w:r>
+        <w:rPr>
+          <w:rFonts w:ascii="Calibri" w:cs="Calibri" w:eastAsia="Calibri" w:hAnsi="Calibri"/>
+          <w:sz w:val="21"/>
+          <w:szCs w:val="21"/>
+        </w:rPr>
+        <w:t xml:space="preserve">Jeu de test reproductible (scripts/seed-e2e.ts) : 30 dossiers couvrant les segments, villes, décisions, classes, étapes, scores anciens et récents, événements, comités proches de l'expiration et équipements à échéance.</w:t>
+      </w:r>
+    </w:p>
+    <w:p>
+      <w:pPr>
+        <w:pStyle w:val="ListParagraph"/>
+        <w:numPr>
+          <w:ilvl w:val="0"/>
+          <w:numId w:val="2"/>
+        </w:numPr>
+        <w:spacing w:after="60" w:line="276"/>
+      </w:pPr>
+      <w:r>
+        <w:rPr>
+          <w:rFonts w:ascii="Calibri" w:cs="Calibri" w:eastAsia="Calibri" w:hAnsi="Calibri"/>
+          <w:sz w:val="21"/>
+          <w:szCs w:val="21"/>
+        </w:rPr>
+        <w:t xml:space="preserve">Connexion de test : identité fixée par E2E_AUTH_EMAIL, changeable par un cookie pour tester un autre profil. Elle n'existe qu'en mode développement : vérifié qu'un build de production lancé avec cette variable renvoie toujours vers la page de connexion.</w:t>
+      </w:r>
+    </w:p>
+    <w:p>
+      <w:pPr>
+        <w:pStyle w:val="ListParagraph"/>
+        <w:numPr>
+          <w:ilvl w:val="0"/>
+          <w:numId w:val="2"/>
+        </w:numPr>
+        <w:spacing w:after="60" w:line="276"/>
+      </w:pPr>
+      <w:r>
+        <w:rPr>
+          <w:rFonts w:ascii="Calibri" w:cs="Calibri" w:eastAsia="Calibri" w:hAnsi="Calibri"/>
+          <w:sz w:val="21"/>
+          <w:szCs w:val="21"/>
+        </w:rPr>
+        <w:t xml:space="preserve">Intégration continue : à chaque push, un job rejoue migrations, jeu de démonstration et jeu de test puis lance les tests d'intégration ; un second job lance les 13 parcours et conserve le rapport en cas d'échec.</w:t>
+      </w:r>
+    </w:p>
+    <w:p>
+      <w:pPr>
+        <w:pStyle w:val="ListParagraph"/>
+        <w:numPr>
+          <w:ilvl w:val="0"/>
+          <w:numId w:val="2"/>
+        </w:numPr>
+        <w:spacing w:after="60" w:line="276"/>
+      </w:pPr>
+      <w:r>
+        <w:rPr>
+          <w:rFonts w:ascii="Calibri" w:cs="Calibri" w:eastAsia="Calibri" w:hAnsi="Calibri"/>
+          <w:sz w:val="21"/>
+          <w:szCs w:val="21"/>
+        </w:rPr>
+        <w:t xml:space="preserve">Amélioration trouvée par ces tests : l'onglet choisi sur la fiche projet est désormais reporté dans l'adresse (?onglet=…) — le lien copié et le rechargement ouvrent le même onglet.</w:t>
+      </w:r>
+    </w:p>
+    <w:tbl>
+      <w:tblPr>
+        <w:tblW w:type="dxa" w:w="9638"/>
+        <w:tblBorders>
+          <w:top w:val="single" w:color="AEB6C6" w:sz="2"/>
+          <w:left w:val="single" w:color="AEB6C6" w:sz="2"/>
+          <w:bottom w:val="single" w:color="AEB6C6" w:sz="2"/>
+          <w:right w:val="single" w:color="AEB6C6" w:sz="2"/>
+          <w:insideH w:val="single" w:color="D0D6E2" w:sz="1"/>
+          <w:insideV w:val="single" w:color="D0D6E2" w:sz="1"/>
+        </w:tblBorders>
+      </w:tblPr>
+      <w:tblGrid>
+        <w:gridCol w:w="4638"/>
+        <w:gridCol w:w="2000"/>
+        <w:gridCol w:w="3000"/>
+      </w:tblGrid>
+      <w:tr>
+        <w:trPr>
+          <w:cantSplit/>
+          <w:tblHeader/>
+        </w:trPr>
+        <w:tc>
+          <w:tcPr>
+            <w:tcW w:type="dxa" w:w="4638"/>
+            <w:shd w:fill="2E5496" w:color="auto" w:val="clear"/>
+            <w:tcMar>
+              <w:top w:type="dxa" w:w="40"/>
+              <w:left w:type="dxa" w:w="80"/>
+              <w:bottom w:type="dxa" w:w="40"/>
+              <w:right w:type="dxa" w:w="80"/>
+            </w:tcMar>
+          </w:tcPr>
+          <w:p>
+            <w:pPr>
+              <w:spacing w:after="0" w:line="240"/>
+            </w:pPr>
+            <w:r>
+              <w:rPr>
+                <w:rFonts w:ascii="Calibri" w:cs="Calibri" w:eastAsia="Calibri" w:hAnsi="Calibri"/>
+                <w:b/>
+                <w:bCs/>
+                <w:color w:val="FFFFFF"/>
+                <w:sz w:val="18"/>
+                <w:szCs w:val="18"/>
+              </w:rPr>
+              <w:t xml:space="preserve">Suite</w:t>
+            </w:r>
+          </w:p>
+        </w:tc>
+        <w:tc>
+          <w:tcPr>
+            <w:tcW w:type="dxa" w:w="2000"/>
+            <w:shd w:fill="2E5496" w:color="auto" w:val="clear"/>
+            <w:tcMar>
+              <w:top w:type="dxa" w:w="40"/>
+              <w:left w:type="dxa" w:w="80"/>
+              <w:bottom w:type="dxa" w:w="40"/>
+              <w:right w:type="dxa" w:w="80"/>
+            </w:tcMar>
+          </w:tcPr>
+          <w:p>
+            <w:pPr>
+              <w:spacing w:after="0" w:line="240"/>
+            </w:pPr>
+            <w:r>
+              <w:rPr>
+                <w:rFonts w:ascii="Calibri" w:cs="Calibri" w:eastAsia="Calibri" w:hAnsi="Calibri"/>
+                <w:b/>
+                <w:bCs/>
+                <w:color w:val="FFFFFF"/>
+                <w:sz w:val="18"/>
+                <w:szCs w:val="18"/>
+              </w:rPr>
+              <w:t xml:space="preserve">Nombre</w:t>
+            </w:r>
+          </w:p>
+        </w:tc>
+        <w:tc>
+          <w:tcPr>
+            <w:tcW w:type="dxa" w:w="3000"/>
+            <w:shd w:fill="2E5496" w:color="auto" w:val="clear"/>
+            <w:tcMar>
+              <w:top w:type="dxa" w:w="40"/>
+              <w:left w:type="dxa" w:w="80"/>
+              <w:bottom w:type="dxa" w:w="40"/>
+              <w:right w:type="dxa" w:w="80"/>
+            </w:tcMar>
+          </w:tcPr>
+          <w:p>
+            <w:pPr>
+              <w:spacing w:after="0" w:line="240"/>
+            </w:pPr>
+            <w:r>
+              <w:rPr>
+                <w:rFonts w:ascii="Calibri" w:cs="Calibri" w:eastAsia="Calibri" w:hAnsi="Calibri"/>
+                <w:b/>
+                <w:bCs/>
+                <w:color w:val="FFFFFF"/>
+                <w:sz w:val="18"/>
+                <w:szCs w:val="18"/>
+              </w:rPr>
+              <w:t xml:space="preserve">Résultat</w:t>
+            </w:r>
+          </w:p>
+        </w:tc>
+      </w:tr>
+      <w:tr>
+        <w:trPr>
+          <w:cantSplit/>
+        </w:trPr>
+        <w:tc>
+          <w:tcPr>
+            <w:tcW w:type="dxa" w:w="4638"/>
+            <w:tcMar>
+              <w:top w:type="dxa" w:w="40"/>
+              <w:left w:type="dxa" w:w="80"/>
+              <w:bottom w:type="dxa" w:w="40"/>
+              <w:right w:type="dxa" w:w="80"/>
+            </w:tcMar>
+          </w:tcPr>
+          <w:p>
+            <w:pPr>
+              <w:spacing w:after="0" w:line="240"/>
+            </w:pPr>
+            <w:r>
+              <w:rPr>
+                <w:rFonts w:ascii="Calibri" w:cs="Calibri" w:eastAsia="Calibri" w:hAnsi="Calibri"/>
+                <w:b/>
+                <w:bCs/>
+                <w:sz w:val="18"/>
+                <w:szCs w:val="18"/>
+              </w:rPr>
+              <w:t xml:space="preserve">Tests unitaires (vitest)</w:t>
+            </w:r>
+          </w:p>
+        </w:tc>
+        <w:tc>
+          <w:tcPr>
+            <w:tcW w:type="dxa" w:w="2000"/>
+            <w:tcMar>
+              <w:top w:type="dxa" w:w="40"/>
+              <w:left w:type="dxa" w:w="80"/>
+              <w:bottom w:type="dxa" w:w="40"/>
+              <w:right w:type="dxa" w:w="80"/>
+            </w:tcMar>
+          </w:tcPr>
+          <w:p>
+            <w:pPr>
+              <w:spacing w:after="0" w:line="240"/>
+              <w:jc w:val="center"/>
+            </w:pPr>
+            <w:r>
+              <w:rPr>
+                <w:rFonts w:ascii="Calibri" w:cs="Calibri" w:eastAsia="Calibri" w:hAnsi="Calibri"/>
+                <w:b w:val="false"/>
+                <w:bCs w:val="false"/>
+                <w:sz w:val="18"/>
+                <w:szCs w:val="18"/>
+              </w:rPr>
+              <w:t xml:space="preserve">405 (+25)</w:t>
+            </w:r>
+          </w:p>
+        </w:tc>
+        <w:tc>
+          <w:tcPr>
+            <w:tcW w:type="dxa" w:w="3000"/>
+            <w:tcMar>
+              <w:top w:type="dxa" w:w="40"/>
+              <w:left w:type="dxa" w:w="80"/>
+              <w:bottom w:type="dxa" w:w="40"/>
+              <w:right w:type="dxa" w:w="80"/>
+            </w:tcMar>
+          </w:tcPr>
+          <w:p>
+            <w:pPr>
+              <w:spacing w:after="0" w:line="240"/>
+              <w:jc w:val="center"/>
+            </w:pPr>
+            <w:r>
+              <w:rPr>
+                <w:rFonts w:ascii="Calibri" w:cs="Calibri" w:eastAsia="Calibri" w:hAnsi="Calibri"/>
+                <w:b w:val="false"/>
+                <w:bCs w:val="false"/>
+                <w:sz w:val="18"/>
+                <w:szCs w:val="18"/>
+              </w:rPr>
+              <w:t xml:space="preserve">Tous réussis</w:t>
+            </w:r>
+          </w:p>
+        </w:tc>
+      </w:tr>
+      <w:tr>
+        <w:trPr>
+          <w:cantSplit/>
+        </w:trPr>
+        <w:tc>
+          <w:tcPr>
+            <w:tcW w:type="dxa" w:w="4638"/>
+            <w:shd w:fill="F2F5FB" w:color="auto" w:val="clear"/>
+            <w:tcMar>
+              <w:top w:type="dxa" w:w="40"/>
+              <w:left w:type="dxa" w:w="80"/>
+              <w:bottom w:type="dxa" w:w="40"/>
+              <w:right w:type="dxa" w:w="80"/>
+            </w:tcMar>
+          </w:tcPr>
+          <w:p>
+            <w:pPr>
+              <w:spacing w:after="0" w:line="240"/>
+            </w:pPr>
+            <w:r>
+              <w:rPr>
+                <w:rFonts w:ascii="Calibri" w:cs="Calibri" w:eastAsia="Calibri" w:hAnsi="Calibri"/>
+                <w:b/>
+                <w:bCs/>
+                <w:sz w:val="18"/>
+                <w:szCs w:val="18"/>
+              </w:rPr>
+              <w:t xml:space="preserve">Tests d'intégration (PostgreSQL réel)</w:t>
+            </w:r>
+          </w:p>
+        </w:tc>
+        <w:tc>
+          <w:tcPr>
+            <w:tcW w:type="dxa" w:w="2000"/>
+            <w:shd w:fill="F2F5FB" w:color="auto" w:val="clear"/>
+            <w:tcMar>
+              <w:top w:type="dxa" w:w="40"/>
+              <w:left w:type="dxa" w:w="80"/>
+              <w:bottom w:type="dxa" w:w="40"/>
+              <w:right w:type="dxa" w:w="80"/>
+            </w:tcMar>
+          </w:tcPr>
+          <w:p>
+            <w:pPr>
+              <w:spacing w:after="0" w:line="240"/>
+              <w:jc w:val="center"/>
+            </w:pPr>
+            <w:r>
+              <w:rPr>
+                <w:rFonts w:ascii="Calibri" w:cs="Calibri" w:eastAsia="Calibri" w:hAnsi="Calibri"/>
+                <w:b w:val="false"/>
+                <w:bCs w:val="false"/>
+                <w:sz w:val="18"/>
+                <w:szCs w:val="18"/>
+              </w:rPr>
+              <w:t xml:space="preserve">4</w:t>
+            </w:r>
+          </w:p>
+        </w:tc>
+        <w:tc>
+          <w:tcPr>
+            <w:tcW w:type="dxa" w:w="3000"/>
+            <w:shd w:fill="F2F5FB" w:color="auto" w:val="clear"/>
+            <w:tcMar>
+              <w:top w:type="dxa" w:w="40"/>
+              <w:left w:type="dxa" w:w="80"/>
+              <w:bottom w:type="dxa" w:w="40"/>
+              <w:right w:type="dxa" w:w="80"/>
+            </w:tcMar>
+          </w:tcPr>
+          <w:p>
+            <w:pPr>
+              <w:spacing w:after="0" w:line="240"/>
+              <w:jc w:val="center"/>
+            </w:pPr>
+            <w:r>
+              <w:rPr>
+                <w:rFonts w:ascii="Calibri" w:cs="Calibri" w:eastAsia="Calibri" w:hAnsi="Calibri"/>
+                <w:b w:val="false"/>
+                <w:bCs w:val="false"/>
+                <w:sz w:val="18"/>
+                <w:szCs w:val="18"/>
+              </w:rPr>
+              <w:t xml:space="preserve">Tous réussis</w:t>
+            </w:r>
+          </w:p>
+        </w:tc>
+      </w:tr>
+      <w:tr>
+        <w:trPr>
+          <w:cantSplit/>
+        </w:trPr>
+        <w:tc>
+          <w:tcPr>
+            <w:tcW w:type="dxa" w:w="4638"/>
+            <w:tcMar>
+              <w:top w:type="dxa" w:w="40"/>
+              <w:left w:type="dxa" w:w="80"/>
+              <w:bottom w:type="dxa" w:w="40"/>
+              <w:right w:type="dxa" w:w="80"/>
+            </w:tcMar>
+          </w:tcPr>
+          <w:p>
+            <w:pPr>
+              <w:spacing w:after="0" w:line="240"/>
+            </w:pPr>
+            <w:r>
+              <w:rPr>
+                <w:rFonts w:ascii="Calibri" w:cs="Calibri" w:eastAsia="Calibri" w:hAnsi="Calibri"/>
+                <w:b/>
+                <w:bCs/>
+                <w:sz w:val="18"/>
+                <w:szCs w:val="18"/>
+              </w:rPr>
+              <w:t xml:space="preserve">Tests de bout en bout (Playwright)</w:t>
+            </w:r>
+          </w:p>
+        </w:tc>
+        <w:tc>
+          <w:tcPr>
+            <w:tcW w:type="dxa" w:w="2000"/>
+            <w:tcMar>
+              <w:top w:type="dxa" w:w="40"/>
+              <w:left w:type="dxa" w:w="80"/>
+              <w:bottom w:type="dxa" w:w="40"/>
+              <w:right w:type="dxa" w:w="80"/>
+            </w:tcMar>
+          </w:tcPr>
+          <w:p>
+            <w:pPr>
+              <w:spacing w:after="0" w:line="240"/>
+              <w:jc w:val="center"/>
+            </w:pPr>
+            <w:r>
+              <w:rPr>
+                <w:rFonts w:ascii="Calibri" w:cs="Calibri" w:eastAsia="Calibri" w:hAnsi="Calibri"/>
+                <w:b w:val="false"/>
+                <w:bCs w:val="false"/>
+                <w:sz w:val="18"/>
+                <w:szCs w:val="18"/>
+              </w:rPr>
+              <w:t xml:space="preserve">13</w:t>
+            </w:r>
+          </w:p>
+        </w:tc>
+        <w:tc>
+          <w:tcPr>
+            <w:tcW w:type="dxa" w:w="3000"/>
+            <w:tcMar>
+              <w:top w:type="dxa" w:w="40"/>
+              <w:left w:type="dxa" w:w="80"/>
+              <w:bottom w:type="dxa" w:w="40"/>
+              <w:right w:type="dxa" w:w="80"/>
+            </w:tcMar>
+          </w:tcPr>
+          <w:p>
+            <w:pPr>
+              <w:spacing w:after="0" w:line="240"/>
+              <w:jc w:val="center"/>
+            </w:pPr>
+            <w:r>
+              <w:rPr>
+                <w:rFonts w:ascii="Calibri" w:cs="Calibri" w:eastAsia="Calibri" w:hAnsi="Calibri"/>
+                <w:b w:val="false"/>
+                <w:bCs w:val="false"/>
+                <w:sz w:val="18"/>
+                <w:szCs w:val="18"/>
+              </w:rPr>
+              <w:t xml:space="preserve">Tous réussis</w:t>
+            </w:r>
+          </w:p>
+        </w:tc>
+      </w:tr>
+      <w:tr>
+        <w:trPr>
+          <w:cantSplit/>
+        </w:trPr>
+        <w:tc>
+          <w:tcPr>
+            <w:tcW w:type="dxa" w:w="4638"/>
+            <w:shd w:fill="F2F5FB" w:color="auto" w:val="clear"/>
+            <w:tcMar>
+              <w:top w:type="dxa" w:w="40"/>
+              <w:left w:type="dxa" w:w="80"/>
+              <w:bottom w:type="dxa" w:w="40"/>
+              <w:right w:type="dxa" w:w="80"/>
+            </w:tcMar>
+          </w:tcPr>
+          <w:p>
+            <w:pPr>
+              <w:spacing w:after="0" w:line="240"/>
+            </w:pPr>
+            <w:r>
+              <w:rPr>
+                <w:rFonts w:ascii="Calibri" w:cs="Calibri" w:eastAsia="Calibri" w:hAnsi="Calibri"/>
+                <w:b/>
+                <w:bCs/>
+                <w:sz w:val="18"/>
+                <w:szCs w:val="18"/>
+              </w:rPr>
+              <w:t xml:space="preserve">Typage, lint, build de production</w:t>
+            </w:r>
+          </w:p>
+        </w:tc>
+        <w:tc>
+          <w:tcPr>
+            <w:tcW w:type="dxa" w:w="2000"/>
+            <w:shd w:fill="F2F5FB" w:color="auto" w:val="clear"/>
+            <w:tcMar>
+              <w:top w:type="dxa" w:w="40"/>
+              <w:left w:type="dxa" w:w="80"/>
+              <w:bottom w:type="dxa" w:w="40"/>
+              <w:right w:type="dxa" w:w="80"/>
+            </w:tcMar>
+          </w:tcPr>
+          <w:p>
+            <w:pPr>
+              <w:spacing w:after="0" w:line="240"/>
+              <w:jc w:val="center"/>
+            </w:pPr>
+            <w:r>
+              <w:rPr>
+                <w:rFonts w:ascii="Calibri" w:cs="Calibri" w:eastAsia="Calibri" w:hAnsi="Calibri"/>
+                <w:b w:val="false"/>
+                <w:bCs w:val="false"/>
+                <w:sz w:val="18"/>
+                <w:szCs w:val="18"/>
+              </w:rPr>
+              <w:t xml:space="preserve">—</w:t>
+            </w:r>
+          </w:p>
+        </w:tc>
+        <w:tc>
+          <w:tcPr>
+            <w:tcW w:type="dxa" w:w="3000"/>
+            <w:shd w:fill="F2F5FB" w:color="auto" w:val="clear"/>
+            <w:tcMar>
+              <w:top w:type="dxa" w:w="40"/>
+              <w:left w:type="dxa" w:w="80"/>
+              <w:bottom w:type="dxa" w:w="40"/>
+              <w:right w:type="dxa" w:w="80"/>
+            </w:tcMar>
+          </w:tcPr>
+          <w:p>
+            <w:pPr>
+              <w:spacing w:after="0" w:line="240"/>
+              <w:jc w:val="center"/>
+            </w:pPr>
+            <w:r>
+              <w:rPr>
+                <w:rFonts w:ascii="Calibri" w:cs="Calibri" w:eastAsia="Calibri" w:hAnsi="Calibri"/>
+                <w:b w:val="false"/>
+                <w:bCs w:val="false"/>
+                <w:sz w:val="18"/>
+                <w:szCs w:val="18"/>
+              </w:rPr>
+              <w:t xml:space="preserve">Sans erreur</w:t>
+            </w:r>
+          </w:p>
+        </w:tc>
+      </w:tr>
+    </w:tbl>
+    <w:p>
+      <w:r>
+        <w:br w:type="page"/>
+      </w:r>
+    </w:p>
+    <w:p>
+      <w:pPr>
+        <w:pStyle w:val="Heading1"/>
+      </w:pPr>
+      <w:r>
         <w:t xml:space="preserve">Annexe — Fichiers modifiés</w:t>
       </w:r>
     </w:p>
@@ -5744,10 +6995,358 @@
           </w:p>
         </w:tc>
       </w:tr>
+      <w:tr>
+        <w:trPr>
+          <w:cantSplit/>
+        </w:trPr>
+        <w:tc>
+          <w:tcPr>
+            <w:tcW w:type="dxa" w:w="3800"/>
+            <w:tcMar>
+              <w:top w:type="dxa" w:w="40"/>
+              <w:left w:type="dxa" w:w="80"/>
+              <w:bottom w:type="dxa" w:w="40"/>
+              <w:right w:type="dxa" w:w="80"/>
+            </w:tcMar>
+          </w:tcPr>
+          <w:p>
+            <w:pPr>
+              <w:spacing w:after="0" w:line="240"/>
+            </w:pPr>
+            <w:r>
+              <w:rPr>
+                <w:rFonts w:ascii="Calibri" w:cs="Calibri" w:eastAsia="Calibri" w:hAnsi="Calibri"/>
+                <w:b w:val="false"/>
+                <w:bCs w:val="false"/>
+                <w:sz w:val="18"/>
+                <w:szCs w:val="18"/>
+              </w:rPr>
+              <w:t xml:space="preserve">server/services/projectList.ts, lib/projectFilters.ts, app/projects/page.tsx, app/api/export/projects</w:t>
+            </w:r>
+          </w:p>
+        </w:tc>
+        <w:tc>
+          <w:tcPr>
+            <w:tcW w:type="dxa" w:w="5838"/>
+            <w:tcMar>
+              <w:top w:type="dxa" w:w="40"/>
+              <w:left w:type="dxa" w:w="80"/>
+              <w:bottom w:type="dxa" w:w="40"/>
+              <w:right w:type="dxa" w:w="80"/>
+            </w:tcMar>
+          </w:tcPr>
+          <w:p>
+            <w:pPr>
+              <w:spacing w:after="0" w:line="240"/>
+            </w:pPr>
+            <w:r>
+              <w:rPr>
+                <w:rFonts w:ascii="Calibri" w:cs="Calibri" w:eastAsia="Calibri" w:hAnsi="Calibri"/>
+                <w:b w:val="false"/>
+                <w:bCs w:val="false"/>
+                <w:sz w:val="18"/>
+                <w:szCs w:val="18"/>
+              </w:rPr>
+              <w:t xml:space="preserve">Liste filtrée, triée et paginée par la base ; export sur la même requête.</w:t>
+            </w:r>
+          </w:p>
+        </w:tc>
+      </w:tr>
+      <w:tr>
+        <w:trPr>
+          <w:cantSplit/>
+        </w:trPr>
+        <w:tc>
+          <w:tcPr>
+            <w:tcW w:type="dxa" w:w="3800"/>
+            <w:shd w:fill="F2F5FB" w:color="auto" w:val="clear"/>
+            <w:tcMar>
+              <w:top w:type="dxa" w:w="40"/>
+              <w:left w:type="dxa" w:w="80"/>
+              <w:bottom w:type="dxa" w:w="40"/>
+              <w:right w:type="dxa" w:w="80"/>
+            </w:tcMar>
+          </w:tcPr>
+          <w:p>
+            <w:pPr>
+              <w:spacing w:after="0" w:line="240"/>
+            </w:pPr>
+            <w:r>
+              <w:rPr>
+                <w:rFonts w:ascii="Calibri" w:cs="Calibri" w:eastAsia="Calibri" w:hAnsi="Calibri"/>
+                <w:b w:val="false"/>
+                <w:bCs w:val="false"/>
+                <w:sz w:val="18"/>
+                <w:szCs w:val="18"/>
+              </w:rPr>
+              <w:t xml:space="preserve">tests/integration, vitest.integration.config.ts, scripts/seed-e2e.ts</w:t>
+            </w:r>
+          </w:p>
+        </w:tc>
+        <w:tc>
+          <w:tcPr>
+            <w:tcW w:type="dxa" w:w="5838"/>
+            <w:shd w:fill="F2F5FB" w:color="auto" w:val="clear"/>
+            <w:tcMar>
+              <w:top w:type="dxa" w:w="40"/>
+              <w:left w:type="dxa" w:w="80"/>
+              <w:bottom w:type="dxa" w:w="40"/>
+              <w:right w:type="dxa" w:w="80"/>
+            </w:tcMar>
+          </w:tcPr>
+          <w:p>
+            <w:pPr>
+              <w:spacing w:after="0" w:line="240"/>
+            </w:pPr>
+            <w:r>
+              <w:rPr>
+                <w:rFonts w:ascii="Calibri" w:cs="Calibri" w:eastAsia="Calibri" w:hAnsi="Calibri"/>
+                <w:b w:val="false"/>
+                <w:bCs w:val="false"/>
+                <w:sz w:val="18"/>
+                <w:szCs w:val="18"/>
+              </w:rPr>
+              <w:t xml:space="preserve">Tests d'intégration sur base réelle ; jeu de test de 30 dossiers.</w:t>
+            </w:r>
+          </w:p>
+        </w:tc>
+      </w:tr>
+      <w:tr>
+        <w:trPr>
+          <w:cantSplit/>
+        </w:trPr>
+        <w:tc>
+          <w:tcPr>
+            <w:tcW w:type="dxa" w:w="3800"/>
+            <w:tcMar>
+              <w:top w:type="dxa" w:w="40"/>
+              <w:left w:type="dxa" w:w="80"/>
+              <w:bottom w:type="dxa" w:w="40"/>
+              <w:right w:type="dxa" w:w="80"/>
+            </w:tcMar>
+          </w:tcPr>
+          <w:p>
+            <w:pPr>
+              <w:spacing w:after="0" w:line="240"/>
+            </w:pPr>
+            <w:r>
+              <w:rPr>
+                <w:rFonts w:ascii="Calibri" w:cs="Calibri" w:eastAsia="Calibri" w:hAnsi="Calibri"/>
+                <w:b w:val="false"/>
+                <w:bCs w:val="false"/>
+                <w:sz w:val="18"/>
+                <w:szCs w:val="18"/>
+              </w:rPr>
+              <w:t xml:space="preserve">lib/themePalette.ts, lib/theme.ts, components/ThemeToggle.tsx, tailwind.config.ts, app/globals.css, app/layout.tsx, tests/theme.test.ts</w:t>
+            </w:r>
+          </w:p>
+        </w:tc>
+        <w:tc>
+          <w:tcPr>
+            <w:tcW w:type="dxa" w:w="5838"/>
+            <w:tcMar>
+              <w:top w:type="dxa" w:w="40"/>
+              <w:left w:type="dxa" w:w="80"/>
+              <w:bottom w:type="dxa" w:w="40"/>
+              <w:right w:type="dxa" w:w="80"/>
+            </w:tcMar>
+          </w:tcPr>
+          <w:p>
+            <w:pPr>
+              <w:spacing w:after="0" w:line="240"/>
+            </w:pPr>
+            <w:r>
+              <w:rPr>
+                <w:rFonts w:ascii="Calibri" w:cs="Calibri" w:eastAsia="Calibri" w:hAnsi="Calibri"/>
+                <w:b w:val="false"/>
+                <w:bCs w:val="false"/>
+                <w:sz w:val="18"/>
+                <w:szCs w:val="18"/>
+              </w:rPr>
+              <w:t xml:space="preserve">Mode sombre, choix du thème, contrôle des contrastes.</w:t>
+            </w:r>
+          </w:p>
+        </w:tc>
+      </w:tr>
+      <w:tr>
+        <w:trPr>
+          <w:cantSplit/>
+        </w:trPr>
+        <w:tc>
+          <w:tcPr>
+            <w:tcW w:type="dxa" w:w="3800"/>
+            <w:shd w:fill="F2F5FB" w:color="auto" w:val="clear"/>
+            <w:tcMar>
+              <w:top w:type="dxa" w:w="40"/>
+              <w:left w:type="dxa" w:w="80"/>
+              <w:bottom w:type="dxa" w:w="40"/>
+              <w:right w:type="dxa" w:w="80"/>
+            </w:tcMar>
+          </w:tcPr>
+          <w:p>
+            <w:pPr>
+              <w:spacing w:after="0" w:line="240"/>
+            </w:pPr>
+            <w:r>
+              <w:rPr>
+                <w:rFonts w:ascii="Calibri" w:cs="Calibri" w:eastAsia="Calibri" w:hAnsi="Calibri"/>
+                <w:b w:val="false"/>
+                <w:bCs w:val="false"/>
+                <w:sz w:val="18"/>
+                <w:szCs w:val="18"/>
+              </w:rPr>
+              <w:t xml:space="preserve">lib/domain/alertDigest.ts, server/services/alertDigest.ts, server/services/mailer.ts, lib/cronAuth.ts, app/api/cron/alert-digest, app/alerts/resume, vercel.json, tests/alertDigest.test.ts</w:t>
+            </w:r>
+          </w:p>
+        </w:tc>
+        <w:tc>
+          <w:tcPr>
+            <w:tcW w:type="dxa" w:w="5838"/>
+            <w:shd w:fill="F2F5FB" w:color="auto" w:val="clear"/>
+            <w:tcMar>
+              <w:top w:type="dxa" w:w="40"/>
+              <w:left w:type="dxa" w:w="80"/>
+              <w:bottom w:type="dxa" w:w="40"/>
+              <w:right w:type="dxa" w:w="80"/>
+            </w:tcMar>
+          </w:tcPr>
+          <w:p>
+            <w:pPr>
+              <w:spacing w:after="0" w:line="240"/>
+            </w:pPr>
+            <w:r>
+              <w:rPr>
+                <w:rFonts w:ascii="Calibri" w:cs="Calibri" w:eastAsia="Calibri" w:hAnsi="Calibri"/>
+                <w:b w:val="false"/>
+                <w:bCs w:val="false"/>
+                <w:sz w:val="18"/>
+                <w:szCs w:val="18"/>
+              </w:rPr>
+              <w:t xml:space="preserve">Résumé hebdomadaire des alertes par e-mail.</w:t>
+            </w:r>
+          </w:p>
+        </w:tc>
+      </w:tr>
+      <w:tr>
+        <w:trPr>
+          <w:cantSplit/>
+        </w:trPr>
+        <w:tc>
+          <w:tcPr>
+            <w:tcW w:type="dxa" w:w="3800"/>
+            <w:tcMar>
+              <w:top w:type="dxa" w:w="40"/>
+              <w:left w:type="dxa" w:w="80"/>
+              <w:bottom w:type="dxa" w:w="40"/>
+              <w:right w:type="dxa" w:w="80"/>
+            </w:tcMar>
+          </w:tcPr>
+          <w:p>
+            <w:pPr>
+              <w:spacing w:after="0" w:line="240"/>
+            </w:pPr>
+            <w:r>
+              <w:rPr>
+                <w:rFonts w:ascii="Calibri" w:cs="Calibri" w:eastAsia="Calibri" w:hAnsi="Calibri"/>
+                <w:b w:val="false"/>
+                <w:bCs w:val="false"/>
+                <w:sz w:val="18"/>
+                <w:szCs w:val="18"/>
+              </w:rPr>
+              <w:t xml:space="preserve">playwright.config.ts, tests/e2e, lib/testAuth.ts, middleware.ts, .github/workflows/ci.yml</w:t>
+            </w:r>
+          </w:p>
+        </w:tc>
+        <w:tc>
+          <w:tcPr>
+            <w:tcW w:type="dxa" w:w="5838"/>
+            <w:tcMar>
+              <w:top w:type="dxa" w:w="40"/>
+              <w:left w:type="dxa" w:w="80"/>
+              <w:bottom w:type="dxa" w:w="40"/>
+              <w:right w:type="dxa" w:w="80"/>
+            </w:tcMar>
+          </w:tcPr>
+          <w:p>
+            <w:pPr>
+              <w:spacing w:after="0" w:line="240"/>
+            </w:pPr>
+            <w:r>
+              <w:rPr>
+                <w:rFonts w:ascii="Calibri" w:cs="Calibri" w:eastAsia="Calibri" w:hAnsi="Calibri"/>
+                <w:b w:val="false"/>
+                <w:bCs w:val="false"/>
+                <w:sz w:val="18"/>
+                <w:szCs w:val="18"/>
+              </w:rPr>
+              <w:t xml:space="preserve">Tests de bout en bout, identité de test hors production, jobs CI.</w:t>
+            </w:r>
+          </w:p>
+        </w:tc>
+      </w:tr>
+      <w:tr>
+        <w:trPr>
+          <w:cantSplit/>
+        </w:trPr>
+        <w:tc>
+          <w:tcPr>
+            <w:tcW w:type="dxa" w:w="3800"/>
+            <w:shd w:fill="F2F5FB" w:color="auto" w:val="clear"/>
+            <w:tcMar>
+              <w:top w:type="dxa" w:w="40"/>
+              <w:left w:type="dxa" w:w="80"/>
+              <w:bottom w:type="dxa" w:w="40"/>
+              <w:right w:type="dxa" w:w="80"/>
+            </w:tcMar>
+          </w:tcPr>
+          <w:p>
+            <w:pPr>
+              <w:spacing w:after="0" w:line="240"/>
+            </w:pPr>
+            <w:r>
+              <w:rPr>
+                <w:rFonts w:ascii="Calibri" w:cs="Calibri" w:eastAsia="Calibri" w:hAnsi="Calibri"/>
+                <w:b w:val="false"/>
+                <w:bCs w:val="false"/>
+                <w:sz w:val="18"/>
+                <w:szCs w:val="18"/>
+              </w:rPr>
+              <w:t xml:space="preserve">components/Tabs.tsx (UrlTabs)</w:t>
+            </w:r>
+          </w:p>
+        </w:tc>
+        <w:tc>
+          <w:tcPr>
+            <w:tcW w:type="dxa" w:w="5838"/>
+            <w:shd w:fill="F2F5FB" w:color="auto" w:val="clear"/>
+            <w:tcMar>
+              <w:top w:type="dxa" w:w="40"/>
+              <w:left w:type="dxa" w:w="80"/>
+              <w:bottom w:type="dxa" w:w="40"/>
+              <w:right w:type="dxa" w:w="80"/>
+            </w:tcMar>
+          </w:tcPr>
+          <w:p>
+            <w:pPr>
+              <w:spacing w:after="0" w:line="240"/>
+            </w:pPr>
+            <w:r>
+              <w:rPr>
+                <w:rFonts w:ascii="Calibri" w:cs="Calibri" w:eastAsia="Calibri" w:hAnsi="Calibri"/>
+                <w:b w:val="false"/>
+                <w:bCs w:val="false"/>
+                <w:sz w:val="18"/>
+                <w:szCs w:val="18"/>
+              </w:rPr>
+              <w:t xml:space="preserve">Onglet de la fiche reporté dans l'adresse.</w:t>
+            </w:r>
+          </w:p>
+        </w:tc>
+      </w:tr>
     </w:tbl>
     <w:sectPr>
-      <w:headerReference w:type="default" r:id="rId7"/>
-      <w:footerReference w:type="default" r:id="rId8"/>
+      <w:headerReference w:type="default" r:id="rId6"/>
+      <w:footerReference w:type="default" r:id="rId7"/>
       <w:pgSz w:w="11906" w:h="16838" w:orient="portrait"/>
       <w:pgMar w:top="1134" w:right="1134" w:bottom="1134" w:left="1134" w:header="708" w:footer="708" w:gutter="0"/>
       <w:pgNumType/>
@@ -5755,10 +7354,6 @@
     </w:sectPr>
   </w:body>
 </w:document>
-</file>
-
-<file path=word/comments.xml><?xml version="1.0" encoding="utf-8"?>
-<w:comments xmlns:cx="http://schemas.microsoft.com/office/drawing/2014/chartex" xmlns:cx1="http://schemas.microsoft.com/office/drawing/2015/9/8/chartex" xmlns:cx2="http://schemas.microsoft.com/office/drawing/2015/10/21/chartex" xmlns:cx3="http://schemas.microsoft.com/office/drawing/2016/5/9/chartex" xmlns:cx4="http://schemas.microsoft.com/office/drawing/2016/5/10/chartex" xmlns:cx5="http://schemas.microsoft.com/office/drawing/2016/5/11/chartex" xmlns:cx6="http://schemas.microsoft.com/office/drawing/2016/5/12/chartex" xmlns:cx7="http://schemas.microsoft.com/office/drawing/2016/5/13/chartex" xmlns:cx8="http://schemas.microsoft.com/office/drawing/2016/5/14/chartex" xmlns:mc="http://schemas.openxmlformats.org/markup-compatibility/2006" xmlns:aink="http://schemas.microsoft.com/office/drawing/2016/ink" xmlns:am3d="http://schemas.microsoft.com/office/drawing/2017/model3d" xmlns:o="urn:schemas-microsoft-com:office:office" xmlns:r="http://schemas.openxmlformats.org/officeDocument/2006/relationships" xmlns:m="http://schemas.openxmlformats.org/officeDocument/2006/math" xmlns:v="urn:schemas-microsoft-com:vml" xmlns:wp14="http://schemas.microsoft.com/office/word/2010/wordprocessingDrawing" xmlns:wp="http://schemas.openxmlformats.org/drawingml/2006/wordprocessingDrawing" xmlns:w10="urn:schemas-microsoft-com:office:word" xmlns:w="http://schemas.openxmlformats.org/wordprocessingml/2006/main" xmlns:w14="http://schemas.microsoft.com/office/word/2010/wordml" xmlns:w15="http://schemas.microsoft.com/office/word/2012/wordml" xmlns:w16cex="http://schemas.microsoft.com/office/word/2018/wordml/cex" xmlns:w16cid="http://schemas.microsoft.com/office/word/2016/wordml/cid" xmlns:w16="http://schemas.microsoft.com/office/word/2018/wordml" xmlns:w16sdtdh="http://schemas.microsoft.com/office/word/2020/wordml/sdtdatahash" xmlns:w16se="http://schemas.microsoft.com/office/word/2015/wordml/symex" xmlns:wpg="http://schemas.microsoft.com/office/word/2010/wordprocessingGroup" xmlns:wpi="http://schemas.microsoft.com/office/word/2010/wordprocessingInk" xmlns:wne="http://schemas.microsoft.com/office/word/2006/wordml" xmlns:wps="http://schemas.microsoft.com/office/word/2010/wordprocessingShape"/>
 </file>
 
 <file path=word/endnotes.xml><?xml version="1.0" encoding="utf-8"?>
@@ -5914,7 +7509,7 @@
 <w:numbering xmlns:wpc="http://schemas.microsoft.com/office/word/2010/wordprocessingCanvas" xmlns:mc="http://schemas.openxmlformats.org/markup-compatibility/2006" xmlns:o="urn:schemas-microsoft-com:office:office" xmlns:r="http://schemas.openxmlformats.org/officeDocument/2006/relationships" xmlns:m="http://schemas.openxmlformats.org/officeDocument/2006/math" xmlns:v="urn:schemas-microsoft-com:vml" xmlns:wp14="http://schemas.microsoft.com/office/word/2010/wordprocessingDrawing" xmlns:wp="http://schemas.openxmlformats.org/drawingml/2006/wordprocessingDrawing" xmlns:w10="urn:schemas-microsoft-com:office:word" xmlns:w="http://schemas.openxmlformats.org/wordprocessingml/2006/main" xmlns:w14="http://schemas.microsoft.com/office/word/2010/wordml" xmlns:w15="http://schemas.microsoft.com/office/word/2012/wordml" xmlns:wpg="http://schemas.microsoft.com/office/word/2010/wordprocessingGroup" xmlns:wpi="http://schemas.microsoft.com/office/word/2010/wordprocessingInk" xmlns:wne="http://schemas.microsoft.com/office/word/2006/wordml" xmlns:wps="http://schemas.microsoft.com/office/word/2010/wordprocessingShape" mc:Ignorable="w14 w15 wp14">
   <w:abstractNum w:abstractNumId="1" w15:restartNumberingAfterBreak="0">
     <w:multiLevelType w:val="hybridMultilevel"/>
-    <w:lvl w:ilvl="0" w15:tentative="1">
+    <w:lvl w:ilvl="0" w:tentative="1">
       <w:start w:val="1"/>
       <w:numFmt w:val="bullet"/>
       <w:lvlText w:val="●"/>
@@ -5923,7 +7518,7 @@
         <w:ind w:left="720" w:hanging="360"/>
       </w:pPr>
     </w:lvl>
-    <w:lvl w:ilvl="1" w15:tentative="1">
+    <w:lvl w:ilvl="1" w:tentative="1">
       <w:start w:val="1"/>
       <w:numFmt w:val="bullet"/>
       <w:lvlText w:val="○"/>
@@ -5932,7 +7527,7 @@
         <w:ind w:left="1440" w:hanging="360"/>
       </w:pPr>
     </w:lvl>
-    <w:lvl w:ilvl="2" w15:tentative="1">
+    <w:lvl w:ilvl="2" w:tentative="1">
       <w:start w:val="1"/>
       <w:numFmt w:val="bullet"/>
       <w:lvlText w:val="■"/>
@@ -5941,7 +7536,7 @@
         <w:ind w:left="2160" w:hanging="360"/>
       </w:pPr>
     </w:lvl>
-    <w:lvl w:ilvl="3" w15:tentative="1">
+    <w:lvl w:ilvl="3" w:tentative="1">
       <w:start w:val="1"/>
       <w:numFmt w:val="bullet"/>
       <w:lvlText w:val="●"/>
@@ -5950,7 +7545,7 @@
         <w:ind w:left="2880" w:hanging="360"/>
       </w:pPr>
     </w:lvl>
-    <w:lvl w:ilvl="4" w15:tentative="1">
+    <w:lvl w:ilvl="4" w:tentative="1">
       <w:start w:val="1"/>
       <w:numFmt w:val="bullet"/>
       <w:lvlText w:val="○"/>
@@ -5959,7 +7554,7 @@
         <w:ind w:left="3600" w:hanging="360"/>
       </w:pPr>
     </w:lvl>
-    <w:lvl w:ilvl="5" w15:tentative="1">
+    <w:lvl w:ilvl="5" w:tentative="1">
       <w:start w:val="1"/>
       <w:numFmt w:val="bullet"/>
       <w:lvlText w:val="■"/>
@@ -5968,7 +7563,7 @@
         <w:ind w:left="4320" w:hanging="360"/>
       </w:pPr>
     </w:lvl>
-    <w:lvl w:ilvl="6" w15:tentative="1">
+    <w:lvl w:ilvl="6" w:tentative="1">
       <w:start w:val="1"/>
       <w:numFmt w:val="bullet"/>
       <w:lvlText w:val="●"/>
@@ -5977,7 +7572,7 @@
         <w:ind w:left="5040" w:hanging="360"/>
       </w:pPr>
     </w:lvl>
-    <w:lvl w:ilvl="7" w15:tentative="1">
+    <w:lvl w:ilvl="7" w:tentative="1">
       <w:start w:val="1"/>
       <w:numFmt w:val="bullet"/>
       <w:lvlText w:val="●"/>
@@ -5986,7 +7581,7 @@
         <w:ind w:left="5760" w:hanging="360"/>
       </w:pPr>
     </w:lvl>
-    <w:lvl w:ilvl="8" w15:tentative="1">
+    <w:lvl w:ilvl="8" w:tentative="1">
       <w:start w:val="1"/>
       <w:numFmt w:val="bullet"/>
       <w:lvlText w:val="●"/>
@@ -5998,7 +7593,7 @@
   </w:abstractNum>
   <w:abstractNum w:abstractNumId="2" w15:restartNumberingAfterBreak="0">
     <w:multiLevelType w:val="hybridMultilevel"/>
-    <w:lvl w:ilvl="0" w15:tentative="1">
+    <w:lvl w:ilvl="0" w:tentative="1">
       <w:start w:val="1"/>
       <w:numFmt w:val="bullet"/>
       <w:lvlText w:val="•"/>
@@ -6036,6 +7631,10 @@
     </w:rPrDefault>
     <w:pPrDefault/>
   </w:docDefaults>
+  <w:style w:type="paragraph" w:styleId="Normal" w:default="1">
+    <w:name w:val="Normal"/>
+    <w:qFormat/>
+  </w:style>
   <w:style w:type="paragraph" w:styleId="Title">
     <w:name w:val="Title"/>
     <w:basedOn w:val="Normal"/>
@@ -6044,28 +7643,6 @@
     <w:rPr>
       <w:sz w:val="56"/>
       <w:szCs w:val="56"/>
-    </w:rPr>
-  </w:style>
-  <w:style w:type="paragraph" w:styleId="Heading1">
-    <w:name w:val="Heading 1"/>
-    <w:basedOn w:val="Normal"/>
-    <w:next w:val="Normal"/>
-    <w:qFormat/>
-    <w:rPr>
-      <w:color w:val="2E74B5"/>
-      <w:sz w:val="32"/>
-      <w:szCs w:val="32"/>
-    </w:rPr>
-  </w:style>
-  <w:style w:type="paragraph" w:styleId="Heading2">
-    <w:name w:val="Heading 2"/>
-    <w:basedOn w:val="Normal"/>
-    <w:next w:val="Normal"/>
-    <w:qFormat/>
-    <w:rPr>
-      <w:color w:val="2E74B5"/>
-      <w:sz w:val="26"/>
-      <w:szCs w:val="26"/>
     </w:rPr>
   </w:style>
   <w:style w:type="paragraph" w:styleId="Heading3">
@@ -6247,4 +7824,294 @@
     </w:rPr>
   </w:style>
 </w:styles>
+</file>
+
+<file path=word/theme/theme1.xml><?xml version="1.0" encoding="utf-8"?>
+<a:theme xmlns:a="http://schemas.openxmlformats.org/drawingml/2006/main" name="Office Theme">
+  <a:themeElements>
+    <a:clrScheme name="Office">
+      <a:dk1>
+        <a:sysClr val="windowText" lastClr="000000"/>
+      </a:dk1>
+      <a:lt1>
+        <a:sysClr val="window" lastClr="FFFFFF"/>
+      </a:lt1>
+      <a:dk2>
+        <a:srgbClr val="44546A"/>
+      </a:dk2>
+      <a:lt2>
+        <a:srgbClr val="E7E6E6"/>
+      </a:lt2>
+      <a:accent1>
+        <a:srgbClr val="4472C4"/>
+      </a:accent1>
+      <a:accent2>
+        <a:srgbClr val="ED7D31"/>
+      </a:accent2>
+      <a:accent3>
+        <a:srgbClr val="A5A5A5"/>
+      </a:accent3>
+      <a:accent4>
+        <a:srgbClr val="FFC000"/>
+      </a:accent4>
+      <a:accent5>
+        <a:srgbClr val="5B9BD5"/>
+      </a:accent5>
+      <a:accent6>
+        <a:srgbClr val="70AD47"/>
+      </a:accent6>
+      <a:hlink>
+        <a:srgbClr val="0563C1"/>
+      </a:hlink>
+      <a:folHlink>
+        <a:srgbClr val="954F72"/>
+      </a:folHlink>
+    </a:clrScheme>
+    <a:fontScheme name="Office">
+      <a:majorFont>
+        <a:latin typeface="Calibri Light" panose="020F0302020204030204"/>
+        <a:ea typeface=""/>
+        <a:cs typeface=""/>
+        <a:font script="Jpan" typeface="游ゴシック Light"/>
+        <a:font script="Hang" typeface="맑은 고딕"/>
+        <a:font script="Hans" typeface="等线 Light"/>
+        <a:font script="Hant" typeface="新細明體"/>
+        <a:font script="Arab" typeface="Times New Roman"/>
+        <a:font script="Hebr" typeface="Times New Roman"/>
+        <a:font script="Thai" typeface="Angsana New"/>
+        <a:font script="Ethi" typeface="Nyala"/>
+        <a:font script="Beng" typeface="Vrinda"/>
+        <a:font script="Gujr" typeface="Shruti"/>
+        <a:font script="Khmr" typeface="MoolBoran"/>
+        <a:font script="Knda" typeface="Tunga"/>
+        <a:font script="Guru" typeface="Raavi"/>
+        <a:font script="Cans" typeface="Euphemia"/>
+        <a:font script="Cher" typeface="Plantagenet Cherokee"/>
+        <a:font script="Yiii" typeface="Microsoft Yi Baiti"/>
+        <a:font script="Tibt" typeface="Microsoft Himalaya"/>
+        <a:font script="Thaa" typeface="MV Boli"/>
+        <a:font script="Deva" typeface="Mangal"/>
+        <a:font script="Telu" typeface="Gautami"/>
+        <a:font script="Taml" typeface="Latha"/>
+        <a:font script="Syrc" typeface="Estrangelo Edessa"/>
+        <a:font script="Orya" typeface="Kalinga"/>
+        <a:font script="Mlym" typeface="Kartika"/>
+        <a:font script="Laoo" typeface="DokChampa"/>
+        <a:font script="Sinh" typeface="Iskoola Pota"/>
+        <a:font script="Mong" typeface="Mongolian Baiti"/>
+        <a:font script="Viet" typeface="Times New Roman"/>
+        <a:font script="Uigh" typeface="Microsoft Uighur"/>
+        <a:font script="Geor" typeface="Sylfaen"/>
+        <a:font script="Armn" typeface="Arial"/>
+        <a:font script="Bugi" typeface="Leelawadee UI"/>
+        <a:font script="Bopo" typeface="Microsoft JhengHei"/>
+        <a:font script="Java" typeface="Javanese Text"/>
+        <a:font script="Lisu" typeface="Segoe UI"/>
+        <a:font script="Mymr" typeface="Myanmar Text"/>
+        <a:font script="Nkoo" typeface="Ebrima"/>
+        <a:font script="Olck" typeface="Nirmala UI"/>
+        <a:font script="Osma" typeface="Ebrima"/>
+        <a:font script="Phag" typeface="Phagspa"/>
+        <a:font script="Syrn" typeface="Estrangelo Edessa"/>
+        <a:font script="Syrj" typeface="Estrangelo Edessa"/>
+        <a:font script="Syre" typeface="Estrangelo Edessa"/>
+        <a:font script="Sora" typeface="Nirmala UI"/>
+        <a:font script="Tale" typeface="Microsoft Tai Le"/>
+        <a:font script="Talu" typeface="Microsoft New Tai Lue"/>
+        <a:font script="Tfng" typeface="Ebrima"/>
+      </a:majorFont>
+      <a:minorFont>
+        <a:latin typeface="Calibri" panose="020F0502020204030204"/>
+        <a:ea typeface=""/>
+        <a:cs typeface=""/>
+        <a:font script="Jpan" typeface="游明朝"/>
+        <a:font script="Hang" typeface="맑은 고딕"/>
+        <a:font script="Hans" typeface="等线"/>
+        <a:font script="Hant" typeface="新細明體"/>
+        <a:font script="Arab" typeface="Arial"/>
+        <a:font script="Hebr" typeface="Arial"/>
+        <a:font script="Thai" typeface="Cordia New"/>
+        <a:font script="Ethi" typeface="Nyala"/>
+        <a:font script="Beng" typeface="Vrinda"/>
+        <a:font script="Gujr" typeface="Shruti"/>
+        <a:font script="Khmr" typeface="DaunPenh"/>
+        <a:font script="Knda" typeface="Tunga"/>
+        <a:font script="Guru" typeface="Raavi"/>
+        <a:font script="Cans" typeface="Euphemia"/>
+        <a:font script="Cher" typeface="Plantagenet Cherokee"/>
+        <a:font script="Yiii" typeface="Microsoft Yi Baiti"/>
+        <a:font script="Tibt" typeface="Microsoft Himalaya"/>
+        <a:font script="Thaa" typeface="MV Boli"/>
+        <a:font script="Deva" typeface="Mangal"/>
+        <a:font script="Telu" typeface="Gautami"/>
+        <a:font script="Taml" typeface="Latha"/>
+        <a:font script="Syrc" typeface="Estrangelo Edessa"/>
+        <a:font script="Orya" typeface="Kalinga"/>
+        <a:font script="Mlym" typeface="Kartika"/>
+        <a:font script="Laoo" typeface="DokChampa"/>
+        <a:font script="Sinh" typeface="Iskoola Pota"/>
+        <a:font script="Mong" typeface="Mongolian Baiti"/>
+        <a:font script="Viet" typeface="Arial"/>
+        <a:font script="Uigh" typeface="Microsoft Uighur"/>
+        <a:font script="Geor" typeface="Sylfaen"/>
+        <a:font script="Armn" typeface="Arial"/>
+        <a:font script="Bugi" typeface="Leelawadee UI"/>
+        <a:font script="Bopo" typeface="Microsoft JhengHei"/>
+        <a:font script="Java" typeface="Javanese Text"/>
+        <a:font script="Lisu" typeface="Segoe UI"/>
+        <a:font script="Mymr" typeface="Myanmar Text"/>
+        <a:font script="Nkoo" typeface="Ebrima"/>
+        <a:font script="Olck" typeface="Nirmala UI"/>
+        <a:font script="Osma" typeface="Ebrima"/>
+        <a:font script="Phag" typeface="Phagspa"/>
+        <a:font script="Syrn" typeface="Estrangelo Edessa"/>
+        <a:font script="Syrj" typeface="Estrangelo Edessa"/>
+        <a:font script="Syre" typeface="Estrangelo Edessa"/>
+        <a:font script="Sora" typeface="Nirmala UI"/>
+        <a:font script="Tale" typeface="Microsoft Tai Le"/>
+        <a:font script="Talu" typeface="Microsoft New Tai Lue"/>
+        <a:font script="Tfng" typeface="Ebrima"/>
+      </a:minorFont>
+    </a:fontScheme>
+    <a:fmtScheme name="Office">
+      <a:fillStyleLst>
+        <a:solidFill>
+          <a:schemeClr val="phClr"/>
+        </a:solidFill>
+        <a:gradFill rotWithShape="true">
+          <a:gsLst>
+            <a:gs pos="0">
+              <a:schemeClr val="phClr">
+                <a:lumMod val="110000"/>
+                <a:satMod val="105000"/>
+                <a:tint val="67000"/>
+              </a:schemeClr>
+            </a:gs>
+            <a:gs pos="50000">
+              <a:schemeClr val="phClr">
+                <a:lumMod val="105000"/>
+                <a:satMod val="103000"/>
+                <a:tint val="73000"/>
+              </a:schemeClr>
+            </a:gs>
+            <a:gs pos="100000">
+              <a:schemeClr val="phClr">
+                <a:lumMod val="105000"/>
+                <a:satMod val="109000"/>
+                <a:tint val="81000"/>
+              </a:schemeClr>
+            </a:gs>
+          </a:gsLst>
+          <a:lin ang="5400000" scaled="false"/>
+        </a:gradFill>
+        <a:gradFill rotWithShape="true">
+          <a:gsLst>
+            <a:gs pos="0">
+              <a:schemeClr val="phClr">
+                <a:satMod val="103000"/>
+                <a:lumMod val="102000"/>
+                <a:tint val="94000"/>
+              </a:schemeClr>
+            </a:gs>
+            <a:gs pos="50000">
+              <a:schemeClr val="phClr">
+                <a:satMod val="110000"/>
+                <a:lumMod val="100000"/>
+                <a:shade val="100000"/>
+              </a:schemeClr>
+            </a:gs>
+            <a:gs pos="100000">
+              <a:schemeClr val="phClr">
+                <a:lumMod val="99000"/>
+                <a:satMod val="120000"/>
+                <a:shade val="78000"/>
+              </a:schemeClr>
+            </a:gs>
+          </a:gsLst>
+          <a:lin ang="5400000" scaled="false"/>
+        </a:gradFill>
+      </a:fillStyleLst>
+      <a:lnStyleLst>
+        <a:ln w="6350" cap="flat" cmpd="sng" algn="ctr">
+          <a:solidFill>
+            <a:schemeClr val="phClr"/>
+          </a:solidFill>
+          <a:prstDash val="solid"/>
+          <a:miter lim="800000"/>
+        </a:ln>
+        <a:ln w="12700" cap="flat" cmpd="sng" algn="ctr">
+          <a:solidFill>
+            <a:schemeClr val="phClr"/>
+          </a:solidFill>
+          <a:prstDash val="solid"/>
+          <a:miter lim="800000"/>
+        </a:ln>
+        <a:ln w="19050" cap="flat" cmpd="sng" algn="ctr">
+          <a:solidFill>
+            <a:schemeClr val="phClr"/>
+          </a:solidFill>
+          <a:prstDash val="solid"/>
+          <a:miter lim="800000"/>
+        </a:ln>
+      </a:lnStyleLst>
+      <a:effectStyleLst>
+        <a:effectStyle>
+          <a:effectLst/>
+        </a:effectStyle>
+        <a:effectStyle>
+          <a:effectLst/>
+        </a:effectStyle>
+        <a:effectStyle>
+          <a:effectLst>
+            <a:outerShdw blurRad="57150" dist="19050" dir="5400000" algn="ctr" rotWithShape="false">
+              <a:srgbClr val="000000">
+                <a:alpha val="63000"/>
+              </a:srgbClr>
+            </a:outerShdw>
+          </a:effectLst>
+        </a:effectStyle>
+      </a:effectStyleLst>
+      <a:bgFillStyleLst>
+        <a:solidFill>
+          <a:schemeClr val="phClr"/>
+        </a:solidFill>
+        <a:solidFill>
+          <a:schemeClr val="phClr">
+            <a:tint val="95000"/>
+            <a:satMod val="170000"/>
+          </a:schemeClr>
+        </a:solidFill>
+        <a:gradFill rotWithShape="true">
+          <a:gsLst>
+            <a:gs pos="0">
+              <a:schemeClr val="phClr">
+                <a:tint val="93000"/>
+                <a:satMod val="150000"/>
+                <a:shade val="98000"/>
+                <a:lumMod val="102000"/>
+              </a:schemeClr>
+            </a:gs>
+            <a:gs pos="50000">
+              <a:schemeClr val="phClr">
+                <a:tint val="98000"/>
+                <a:satMod val="130000"/>
+                <a:shade val="90000"/>
+                <a:lumMod val="103000"/>
+              </a:schemeClr>
+            </a:gs>
+            <a:gs pos="100000">
+              <a:schemeClr val="phClr">
+                <a:shade val="63000"/>
+                <a:satMod val="120000"/>
+              </a:schemeClr>
+            </a:gs>
+          </a:gsLst>
+          <a:lin ang="5400000" scaled="false"/>
+        </a:gradFill>
+      </a:bgFillStyleLst>
+    </a:fmtScheme>
+  </a:themeElements>
+  <a:objectDefaults/>
+  <a:extraClrSchemeLst/>
+</a:theme>
 </file>
</xml_diff>